<commit_message>
Replace chatbot project files new
</commit_message>
<xml_diff>
--- a/data/Noi_dung_slide_CASA_Viking.docx
+++ b/data/Noi_dung_slide_CASA_Viking.docx
@@ -8830,8 +8830,6 @@
         </w:rPr>
         <w:t xml:space="preserve">GOOD và NOT GOOD </w:t>
       </w:r>
-      <w:bookmarkStart w:id="0" w:name="_GoBack"/>
-      <w:bookmarkEnd w:id="0"/>
       <w:r>
         <w:rPr>
           <w:rFonts w:ascii="Calibri" w:eastAsia="Calibri" w:hAnsi="Calibri"/>
@@ -13826,12 +13824,12 @@
           <w:rFonts w:ascii="Calibri" w:eastAsia="Calibri" w:hAnsi="Calibri"/>
         </w:rPr>
         <w:lastRenderedPageBreak/>
-        <w:t>Slide 24 — Dự phóng hiệu quả tăng trưởng CASA qua các giải pháp ứng dụng đề xuất</w:t>
+        <w:t>Slide 24 — Dự phóng tác động CASA và P&amp;L tăng thêm của danh mục giải pháp</w:t>
       </w:r>
     </w:p>
     <w:p>
       <w:r>
-        <w:t>Phần dự phóng đánh giá quy mô khách hàng, sản phẩm, CASA tăng thêm, thu nhập, chi phí và hiệu quả ròng của các giải pháp số.</w:t>
+        <w:t>P&amp;L (Profit &amp; Loss) tăng thêm thể hiện thu nhập tăng thêm, chi phí trực tiếp tăng thêm và đóng góp ròng của các giải pháp số; phần KPI vận hành bao gồm quy mô khách hàng, sản phẩm và CASA.</w:t>
       </w:r>
     </w:p>
     <w:p>
@@ -13844,7 +13842,7 @@
           <w:rFonts w:ascii="Calibri" w:eastAsia="Calibri" w:hAnsi="Calibri"/>
         </w:rPr>
         <w:lastRenderedPageBreak/>
-        <w:t>Slide 25 — Giả thiết mô hình dự phóng hiệu quả giải pháp số trên App SHB SAHA</w:t>
+        <w:t>Slide 25 — Giả thiết mô hình dự phóng hiệu quả giải pháp số (App SHB SAHA)</w:t>
       </w:r>
     </w:p>
     <w:p>
@@ -13855,7 +13853,7 @@
         <w:rPr>
           <w:rFonts w:ascii="Calibri" w:eastAsia="Calibri" w:hAnsi="Calibri"/>
         </w:rPr>
-        <w:t>A. Quy mô khách hàng</w:t>
+        <w:t>A. Quy mô và phễu khách hàng mục tiêu</w:t>
       </w:r>
     </w:p>
     <w:p>
@@ -13878,6 +13876,7 @@
       </w:tblGrid>
       <w:tr>
         <w:trPr>
+          <w:cantSplit/>
           <w:tblHeader/>
         </w:trPr>
         <w:tc>
@@ -13909,7 +13908,7 @@
                 <w:color w:val="0B2545"/>
                 <w:sz w:val="17"/>
               </w:rPr>
-              <w:t>Chỉ tiêu</w:t>
+              <w:t>Giả định quy mô</w:t>
             </w:r>
           </w:p>
         </w:tc>
@@ -13975,12 +13974,15 @@
                 <w:color w:val="0B2545"/>
                 <w:sz w:val="17"/>
               </w:rPr>
-              <w:t>Giải thích</w:t>
+              <w:t>Cơ sở / diễn giải</w:t>
             </w:r>
           </w:p>
         </w:tc>
       </w:tr>
       <w:tr>
+        <w:trPr>
+          <w:cantSplit/>
+        </w:trPr>
         <w:tc>
           <w:tcPr>
             <w:tcW w:w="3500" w:type="dxa"/>
@@ -14007,7 +14009,7 @@
                 <w:b/>
                 <w:sz w:val="17"/>
               </w:rPr>
-              <w:t>Tổng KH mới mở CIF lũy kế đến 31/07/2026 (ước tính)</w:t>
+              <w:t>Tổng khách hàng mở CIF lũy kế đến 31/07/2026 (ước tính)</w:t>
             </w:r>
           </w:p>
         </w:tc>
@@ -14067,12 +14069,15 @@
               <w:rPr>
                 <w:sz w:val="17"/>
               </w:rPr>
-              <w:t>Tổng KH active 5T/2026 trừ SLKH GOOD theo tiêu chí CASA và số sản phẩm/dịch vụ.</w:t>
+              <w:t>Tổng số KH active 5T/2026 trừ số KH GOOD (CASA bình quân ≥ 3 triệu đồng ở kênh quầy hoặc ≥ 1 triệu đồng ở kênh số, và số SPDV bình quân ≥ 2).</w:t>
             </w:r>
           </w:p>
         </w:tc>
       </w:tr>
       <w:tr>
+        <w:trPr>
+          <w:cantSplit/>
+        </w:trPr>
         <w:tc>
           <w:tcPr>
             <w:tcW w:w="3500" w:type="dxa"/>
@@ -14099,7 +14104,7 @@
                 <w:b/>
                 <w:sz w:val="17"/>
               </w:rPr>
-              <w:t>Tỷ lệ KH phù hợp chân dung</w:t>
+              <w:t>Tỷ lệ khách hàng phù hợp chân dung mục tiêu (nữ 25–44 tuổi, thu nhập 20–60 triệu đồng, ...)</w:t>
             </w:r>
           </w:p>
         </w:tc>
@@ -14159,12 +14164,15 @@
               <w:rPr>
                 <w:sz w:val="17"/>
               </w:rPr>
-              <w:t>Theo mô hình máy học, tác động vào 30% khách hàng tốt nhất trong tập NOT GOOD.</w:t>
+              <w:t>Theo mô hình máy học, dự kiến tệp khách hàng khả thi tác động là 30% khách hàng tốt nhất trong tập KH NOT GOOD.</w:t>
             </w:r>
           </w:p>
         </w:tc>
       </w:tr>
       <w:tr>
+        <w:trPr>
+          <w:cantSplit/>
+        </w:trPr>
         <w:tc>
           <w:tcPr>
             <w:tcW w:w="3500" w:type="dxa"/>
@@ -14191,7 +14199,7 @@
                 <w:b/>
                 <w:sz w:val="17"/>
               </w:rPr>
-              <w:t>KH mới mở CIF qua kênh số/tháng (T8/2026-T7/2027)</w:t>
+              <w:t>Khách hàng mở CIF mới qua kênh số mỗi tháng (T8/2026–T7/2027)</w:t>
             </w:r>
           </w:p>
         </w:tc>
@@ -14251,12 +14259,15 @@
               <w:rPr>
                 <w:sz w:val="17"/>
               </w:rPr>
-              <w:t>Bình quân 3 tháng gần nhất 43.617 KH, tăng theo tốc độ tăng trưởng kép 6 tháng đầu năm là 3,3%.</w:t>
+              <w:t>Số KH active mở mới tháng 08/2026 dự kiến bằng bình quân 3 tháng gần nhất (43.617 KH); từ T8/2026 đến T7/2027 dự kiến tăng theo tốc độ tăng trưởng kép 6 tháng đầu năm là 3,3%.</w:t>
             </w:r>
           </w:p>
         </w:tc>
       </w:tr>
       <w:tr>
+        <w:trPr>
+          <w:cantSplit/>
+        </w:trPr>
         <w:tc>
           <w:tcPr>
             <w:tcW w:w="3500" w:type="dxa"/>
@@ -14283,7 +14294,7 @@
                 <w:b/>
                 <w:sz w:val="17"/>
               </w:rPr>
-              <w:t>KH nền hiện có phù hợp chân dung tại T8/2026</w:t>
+              <w:t>Khách hàng nền hiện có phù hợp chân dung tại T8/2026</w:t>
             </w:r>
           </w:p>
         </w:tc>
@@ -14343,12 +14354,15 @@
               <w:rPr>
                 <w:sz w:val="17"/>
               </w:rPr>
-              <w:t>Giá trị nền hiện có.</w:t>
+              <w:t>Quy mô khách hàng nền hiện có phù hợp chân dung tại thời điểm T8/2026.</w:t>
             </w:r>
           </w:p>
         </w:tc>
       </w:tr>
       <w:tr>
+        <w:trPr>
+          <w:cantSplit/>
+        </w:trPr>
         <w:tc>
           <w:tcPr>
             <w:tcW w:w="3500" w:type="dxa"/>
@@ -14375,7 +14389,7 @@
                 <w:b/>
                 <w:sz w:val="17"/>
               </w:rPr>
-              <w:t>KH mới/tháng phù hợp chân dung, kênh số</w:t>
+              <w:t>Khách hàng tiềm năng mới mỗi tháng qua kênh số (T8/2026–T7/2027)</w:t>
             </w:r>
           </w:p>
         </w:tc>
@@ -14435,7 +14449,7 @@
               <w:rPr>
                 <w:sz w:val="17"/>
               </w:rPr>
-              <w:t>KH mới T8/2026-T7/2027 nhân tỷ lệ GOOD bình quân hai tháng 01-02/2026 và thêm 30% NOT GOOD tiềm năng.</w:t>
+              <w:t>Số KH active mở mới T8/2026–T7/2027 nhân với tỷ lệ KH GOOD bình quân của cohort T1–T2/2026, cộng thêm tỷ lệ dự kiến 30% KH NOT GOOD tiềm năng tăng lên GOOD.</w:t>
             </w:r>
           </w:p>
         </w:tc>
@@ -14449,7 +14463,7 @@
         <w:rPr>
           <w:rFonts w:ascii="Calibri" w:eastAsia="Calibri" w:hAnsi="Calibri"/>
         </w:rPr>
-        <w:t>B. Tham số kinh tế trên mỗi khách hàng</w:t>
+        <w:t>B. Giả định kinh tế trên mỗi khách hàng/sản phẩm (Unit Economics)</w:t>
       </w:r>
     </w:p>
     <w:p>
@@ -14472,6 +14486,7 @@
       </w:tblGrid>
       <w:tr>
         <w:trPr>
+          <w:cantSplit/>
           <w:tblHeader/>
         </w:trPr>
         <w:tc>
@@ -14503,7 +14518,7 @@
                 <w:color w:val="0B2545"/>
                 <w:sz w:val="17"/>
               </w:rPr>
-              <w:t>Chỉ tiêu</w:t>
+              <w:t>Tham số kinh tế (Unit Economics)</w:t>
             </w:r>
           </w:p>
         </w:tc>
@@ -14569,12 +14584,15 @@
                 <w:color w:val="0B2545"/>
                 <w:sz w:val="17"/>
               </w:rPr>
-              <w:t>Giải thích</w:t>
+              <w:t>Cơ sở / giả định</w:t>
             </w:r>
           </w:p>
         </w:tc>
       </w:tr>
       <w:tr>
+        <w:trPr>
+          <w:cantSplit/>
+        </w:trPr>
         <w:tc>
           <w:tcPr>
             <w:tcW w:w="3500" w:type="dxa"/>
@@ -14601,7 +14619,7 @@
                 <w:b/>
                 <w:sz w:val="17"/>
               </w:rPr>
-              <w:t>CASA bình quân tăng thêm/KH hoàn thành Bước 2 trở lên</w:t>
+              <w:t>CASA bình quân tăng thêm/KH hoàn thành Bước 2 (Auto Billing) trở lên</w:t>
             </w:r>
           </w:p>
         </w:tc>
@@ -14661,12 +14679,15 @@
               <w:rPr>
                 <w:sz w:val="17"/>
               </w:rPr>
-              <w:t>Chênh lệch CASA trung vị giữa CASA+EB (5,5 triệu) và CASA+EB+tính năng thanh toán (6,2 triệu).</w:t>
+              <w:t>Ước tính từ chênh lệch CASA trung vị giữa nhóm CASA+EB (5,5 triệu đồng) và nhóm CASA+EB+tính năng thanh toán (6,2 triệu đồng).</w:t>
             </w:r>
           </w:p>
         </w:tc>
       </w:tr>
       <w:tr>
+        <w:trPr>
+          <w:cantSplit/>
+        </w:trPr>
         <w:tc>
           <w:tcPr>
             <w:tcW w:w="3500" w:type="dxa"/>
@@ -14693,7 +14714,7 @@
                 <w:b/>
                 <w:sz w:val="17"/>
               </w:rPr>
-              <w:t>NIM CASA</w:t>
+              <w:t>CASA bình quân tăng thêm/KH hoàn thành combo SPDV từ tháng thứ 3</w:t>
             </w:r>
           </w:p>
         </w:tc>
@@ -14723,7 +14744,7 @@
               <w:rPr>
                 <w:sz w:val="17"/>
               </w:rPr>
-              <w:t>4,0%/năm</w:t>
+              <w:t>300.000 đ/KH</w:t>
             </w:r>
           </w:p>
         </w:tc>
@@ -14753,12 +14774,15 @@
               <w:rPr>
                 <w:sz w:val="17"/>
               </w:rPr>
-              <w:t>Theo thực hiện 6T/2026.</w:t>
+              <w:t>Ước tính sau khi sử dụng đa dạng SPDV (thẻ tín dụng, vay thấu chi, tài khoản thanh toán, bảo hiểm, ...). Quan sát phân tích CASA bình quân P50 trong tập KH GOOD tăng thêm khoảng 20%–45%; giả định mức tăng bình quân 30% từ P50 CASA nền khoảng 1 triệu đồng.</w:t>
             </w:r>
           </w:p>
         </w:tc>
       </w:tr>
       <w:tr>
+        <w:trPr>
+          <w:cantSplit/>
+        </w:trPr>
         <w:tc>
           <w:tcPr>
             <w:tcW w:w="3500" w:type="dxa"/>
@@ -14785,7 +14809,7 @@
                 <w:b/>
                 <w:sz w:val="17"/>
               </w:rPr>
-              <w:t>Số dư sổ tiết kiệm bình quân/sổ - Bước 3a</w:t>
+              <w:t>NIM CASA</w:t>
             </w:r>
           </w:p>
         </w:tc>
@@ -14815,7 +14839,7 @@
               <w:rPr>
                 <w:sz w:val="17"/>
               </w:rPr>
-              <w:t>20.000.000 đ/sổ</w:t>
+              <w:t>4,0%/năm</w:t>
             </w:r>
           </w:p>
         </w:tc>
@@ -14845,12 +14869,15 @@
               <w:rPr>
                 <w:sz w:val="17"/>
               </w:rPr>
-              <w:t>Theo giả thiết.</w:t>
+              <w:t>Theo thực hiện 6T/2026.</w:t>
             </w:r>
           </w:p>
         </w:tc>
       </w:tr>
       <w:tr>
+        <w:trPr>
+          <w:cantSplit/>
+        </w:trPr>
         <w:tc>
           <w:tcPr>
             <w:tcW w:w="3500" w:type="dxa"/>
@@ -14877,7 +14904,7 @@
                 <w:b/>
                 <w:sz w:val="17"/>
               </w:rPr>
-              <w:t>Lãi suất ưu đãi bổ sung - Bước 3a</w:t>
+              <w:t>Số dư sổ tiết kiệm bình quân/sổ - Bước 3a</w:t>
             </w:r>
           </w:p>
         </w:tc>
@@ -14907,7 +14934,7 @@
               <w:rPr>
                 <w:sz w:val="17"/>
               </w:rPr>
-              <w:t>0,2%/năm</w:t>
+              <w:t>20.000.000 đ/sổ</w:t>
             </w:r>
           </w:p>
         </w:tc>
@@ -14937,12 +14964,15 @@
               <w:rPr>
                 <w:sz w:val="17"/>
               </w:rPr>
-              <w:t>Theo đề bài.</w:t>
+              <w:t>Theo giả thiết.</w:t>
             </w:r>
           </w:p>
         </w:tc>
       </w:tr>
       <w:tr>
+        <w:trPr>
+          <w:cantSplit/>
+        </w:trPr>
         <w:tc>
           <w:tcPr>
             <w:tcW w:w="3500" w:type="dxa"/>
@@ -14969,7 +14999,7 @@
                 <w:b/>
                 <w:sz w:val="17"/>
               </w:rPr>
-              <w:t>NIM TGCKH</w:t>
+              <w:t>Lãi suất ưu đãi bổ sung - Bước 3a</w:t>
             </w:r>
           </w:p>
         </w:tc>
@@ -14999,7 +15029,7 @@
               <w:rPr>
                 <w:sz w:val="17"/>
               </w:rPr>
-              <w:t>1,0%/năm</w:t>
+              <w:t>0,2%/năm</w:t>
             </w:r>
           </w:p>
         </w:tc>
@@ -15029,12 +15059,15 @@
               <w:rPr>
                 <w:sz w:val="17"/>
               </w:rPr>
-              <w:t>Theo thực hiện 6T/2026.</w:t>
+              <w:t>Theo đề bài (+0,2%).</w:t>
             </w:r>
           </w:p>
         </w:tc>
       </w:tr>
       <w:tr>
+        <w:trPr>
+          <w:cantSplit/>
+        </w:trPr>
         <w:tc>
           <w:tcPr>
             <w:tcW w:w="3500" w:type="dxa"/>
@@ -15061,7 +15094,7 @@
                 <w:b/>
                 <w:sz w:val="17"/>
               </w:rPr>
-              <w:t>Mức thưởng tối đa/KH/năm - Bước 3a</w:t>
+              <w:t>NIM TGCKH</w:t>
             </w:r>
           </w:p>
         </w:tc>
@@ -15091,7 +15124,7 @@
               <w:rPr>
                 <w:sz w:val="17"/>
               </w:rPr>
-              <w:t>500.000 đ/KH/năm</w:t>
+              <w:t>1,0%/năm</w:t>
             </w:r>
           </w:p>
         </w:tc>
@@ -15121,12 +15154,15 @@
               <w:rPr>
                 <w:sz w:val="17"/>
               </w:rPr>
-              <w:t>Giả thiết, tương ứng giá trị X trong đề bài.</w:t>
+              <w:t>Theo thực hiện 6T/2026.</w:t>
             </w:r>
           </w:p>
         </w:tc>
       </w:tr>
       <w:tr>
+        <w:trPr>
+          <w:cantSplit/>
+        </w:trPr>
         <w:tc>
           <w:tcPr>
             <w:tcW w:w="3500" w:type="dxa"/>
@@ -15153,7 +15189,7 @@
                 <w:b/>
                 <w:sz w:val="17"/>
               </w:rPr>
-              <w:t>Phí bảo hiểm bình quân/hợp đồng - Bước 3b</w:t>
+              <w:t>Mức thưởng tối đa/KH/năm - Bước 3a</w:t>
             </w:r>
           </w:p>
         </w:tc>
@@ -15183,7 +15219,7 @@
               <w:rPr>
                 <w:sz w:val="17"/>
               </w:rPr>
-              <w:t>1.650.000 đ/HĐ</w:t>
+              <w:t>500.000 đ/KH/năm</w:t>
             </w:r>
           </w:p>
         </w:tc>
@@ -15213,12 +15249,15 @@
               <w:rPr>
                 <w:sz w:val="17"/>
               </w:rPr>
-              <w:t>Giá trị Bậc 3 của mô hình phân bậc 5 cấp.</w:t>
+              <w:t>Giả thiết, tương ứng giá trị X trong đề bài.</w:t>
             </w:r>
           </w:p>
         </w:tc>
       </w:tr>
       <w:tr>
+        <w:trPr>
+          <w:cantSplit/>
+        </w:trPr>
         <w:tc>
           <w:tcPr>
             <w:tcW w:w="3500" w:type="dxa"/>
@@ -15245,7 +15284,8 @@
                 <w:b/>
                 <w:sz w:val="17"/>
               </w:rPr>
-              <w:t>Tỷ lệ hoa hồng bảo hiểm phi nhân thọ</w:t>
+              <w:lastRenderedPageBreak/>
+              <w:t>Phí bảo hiểm bình quân/hợp đồng - Bước 3b</w:t>
             </w:r>
           </w:p>
         </w:tc>
@@ -15275,7 +15315,7 @@
               <w:rPr>
                 <w:sz w:val="17"/>
               </w:rPr>
-              <w:t>30,0%</w:t>
+              <w:t>1.650.000 đ/HĐ</w:t>
             </w:r>
           </w:p>
         </w:tc>
@@ -15305,12 +15345,15 @@
               <w:rPr>
                 <w:sz w:val="17"/>
               </w:rPr>
-              <w:t>Giả thiết tham khảo theo tỷ lệ 6T/2026.</w:t>
+              <w:t>Lấy giá trị Bậc 3 (giữa) của mô hình phân bậc 5 cấp đã xây dựng.</w:t>
             </w:r>
           </w:p>
         </w:tc>
       </w:tr>
       <w:tr>
+        <w:trPr>
+          <w:cantSplit/>
+        </w:trPr>
         <w:tc>
           <w:tcPr>
             <w:tcW w:w="3500" w:type="dxa"/>
@@ -15337,7 +15380,7 @@
                 <w:b/>
                 <w:sz w:val="17"/>
               </w:rPr>
-              <w:t>Chi phí khuyến mãi/hợp đồng bảo hiểm</w:t>
+              <w:t>Tỷ lệ hoa hồng bảo hiểm phi nhân thọ</w:t>
             </w:r>
           </w:p>
         </w:tc>
@@ -15367,7 +15410,7 @@
               <w:rPr>
                 <w:sz w:val="17"/>
               </w:rPr>
-              <w:t>50.000 đ/HĐ</w:t>
+              <w:t>30,0%</w:t>
             </w:r>
           </w:p>
         </w:tc>
@@ -15397,12 +15440,15 @@
               <w:rPr>
                 <w:sz w:val="17"/>
               </w:rPr>
-              <w:t>Giả thiết.</w:t>
+              <w:t>Giả thiết tham khảo theo tỷ lệ 6T/2026.</w:t>
             </w:r>
           </w:p>
         </w:tc>
       </w:tr>
       <w:tr>
+        <w:trPr>
+          <w:cantSplit/>
+        </w:trPr>
         <w:tc>
           <w:tcPr>
             <w:tcW w:w="3500" w:type="dxa"/>
@@ -15429,7 +15475,7 @@
                 <w:b/>
                 <w:sz w:val="17"/>
               </w:rPr>
-              <w:t>Doanh thu chia sẻ/TK chứng khoán mở mới - Bước 3c</w:t>
+              <w:t>Chi phí khuyến mãi/hợp đồng bảo hiểm</w:t>
             </w:r>
           </w:p>
         </w:tc>
@@ -15459,7 +15505,7 @@
               <w:rPr>
                 <w:sz w:val="17"/>
               </w:rPr>
-              <w:t>Chưa xác định</w:t>
+              <w:t>50.000 đ/HĐ</w:t>
             </w:r>
           </w:p>
         </w:tc>
@@ -15489,12 +15535,15 @@
               <w:rPr>
                 <w:sz w:val="17"/>
               </w:rPr>
-              <w:t>Phí giới thiệu/chia sẻ hoa hồng môi giới năm đầu; cần xác nhận với team giải pháp và SHS.</w:t>
+              <w:t>Giả thiết.</w:t>
             </w:r>
           </w:p>
         </w:tc>
       </w:tr>
       <w:tr>
+        <w:trPr>
+          <w:cantSplit/>
+        </w:trPr>
         <w:tc>
           <w:tcPr>
             <w:tcW w:w="3500" w:type="dxa"/>
@@ -15521,7 +15570,7 @@
                 <w:b/>
                 <w:sz w:val="17"/>
               </w:rPr>
-              <w:t>Chi tiêu thẻ tín dụng bình quân/thẻ/tháng - Bước 4</w:t>
+              <w:t>Doanh thu chia sẻ/tài khoản chứng khoán SHS mở mới - Bước 3c</w:t>
             </w:r>
           </w:p>
         </w:tc>
@@ -15551,7 +15600,7 @@
               <w:rPr>
                 <w:sz w:val="17"/>
               </w:rPr>
-              <w:t>5.000.000 đ/thẻ/tháng</w:t>
+              <w:t>Chưa xác định</w:t>
             </w:r>
           </w:p>
         </w:tc>
@@ -15581,12 +15630,15 @@
               <w:rPr>
                 <w:sz w:val="17"/>
               </w:rPr>
-              <w:t>Ước tính khoảng 15% thu nhập bình quân persona 20-60 triệu/tháng.</w:t>
+              <w:t>Giả thiết: phí giới thiệu/chia sẻ hoa hồng môi giới năm đầu; cần xác nhận với team giải pháp và SHS.</w:t>
             </w:r>
           </w:p>
         </w:tc>
       </w:tr>
       <w:tr>
+        <w:trPr>
+          <w:cantSplit/>
+        </w:trPr>
         <w:tc>
           <w:tcPr>
             <w:tcW w:w="3500" w:type="dxa"/>
@@ -15613,7 +15665,7 @@
                 <w:b/>
                 <w:sz w:val="17"/>
               </w:rPr>
-              <w:t>Tỷ lệ phí giao dịch thẻ tín dụng</w:t>
+              <w:t>Chi tiêu thẻ tín dụng bình quân/thẻ/tháng - Bước 4</w:t>
             </w:r>
           </w:p>
         </w:tc>
@@ -15643,7 +15695,7 @@
               <w:rPr>
                 <w:sz w:val="17"/>
               </w:rPr>
-              <w:t>0,6%</w:t>
+              <w:t>5.000.000 đ/thẻ/tháng</w:t>
             </w:r>
           </w:p>
         </w:tc>
@@ -15673,12 +15725,15 @@
               <w:rPr>
                 <w:sz w:val="17"/>
               </w:rPr>
-              <w:t>Giả thiết bình quân theo tư vấn Team GP Thẻ TD.</w:t>
+              <w:t>Giả thiết, ước tính khoảng 15% thu nhập bình quân persona 20–60 triệu đồng/tháng.</w:t>
             </w:r>
           </w:p>
         </w:tc>
       </w:tr>
       <w:tr>
+        <w:trPr>
+          <w:cantSplit/>
+        </w:trPr>
         <w:tc>
           <w:tcPr>
             <w:tcW w:w="3500" w:type="dxa"/>
@@ -15705,8 +15760,7 @@
                 <w:b/>
                 <w:sz w:val="17"/>
               </w:rPr>
-              <w:lastRenderedPageBreak/>
-              <w:t>Chi phí e-voucher/thẻ tín dụng mới</w:t>
+              <w:t>Tỷ lệ phí giao dịch thẻ tín dụng</w:t>
             </w:r>
           </w:p>
         </w:tc>
@@ -15736,7 +15790,7 @@
               <w:rPr>
                 <w:sz w:val="17"/>
               </w:rPr>
-              <w:t>Chưa xác định</w:t>
+              <w:t>0,6%</w:t>
             </w:r>
           </w:p>
         </w:tc>
@@ -15766,12 +15820,15 @@
               <w:rPr>
                 <w:sz w:val="17"/>
               </w:rPr>
-              <w:t>Giả thiết.</w:t>
+              <w:t>Giả thiết bình quân theo tư vấn của Team Giải pháp Thẻ tín dụng.</w:t>
             </w:r>
           </w:p>
         </w:tc>
       </w:tr>
       <w:tr>
+        <w:trPr>
+          <w:cantSplit/>
+        </w:trPr>
         <w:tc>
           <w:tcPr>
             <w:tcW w:w="3500" w:type="dxa"/>
@@ -15798,7 +15855,7 @@
                 <w:b/>
                 <w:sz w:val="17"/>
               </w:rPr>
-              <w:t>Hạn mức thấu chi bình quân/KH - Bước 5</w:t>
+              <w:t>Chi phí e-voucher/thẻ tín dụng mới</w:t>
             </w:r>
           </w:p>
         </w:tc>
@@ -15828,7 +15885,7 @@
               <w:rPr>
                 <w:sz w:val="17"/>
               </w:rPr>
-              <w:t>20.000.000 đ/KH</w:t>
+              <w:t>Chưa xác định</w:t>
             </w:r>
           </w:p>
         </w:tc>
@@ -15858,12 +15915,15 @@
               <w:rPr>
                 <w:sz w:val="17"/>
               </w:rPr>
-              <w:t>Khoảng 25% CASA bình quân duy trì của nhóm CASA cao.</w:t>
+              <w:t>Giả thiết.</w:t>
             </w:r>
           </w:p>
         </w:tc>
       </w:tr>
       <w:tr>
+        <w:trPr>
+          <w:cantSplit/>
+        </w:trPr>
         <w:tc>
           <w:tcPr>
             <w:tcW w:w="3500" w:type="dxa"/>
@@ -15890,7 +15950,7 @@
                 <w:b/>
                 <w:sz w:val="17"/>
               </w:rPr>
-              <w:t>Tỷ lệ sử dụng hạn mức thấu chi bình quân</w:t>
+              <w:t>Hạn mức thấu chi bình quân/KH - Bước 5</w:t>
             </w:r>
           </w:p>
         </w:tc>
@@ -15920,7 +15980,7 @@
               <w:rPr>
                 <w:sz w:val="17"/>
               </w:rPr>
-              <w:t>40,0%</w:t>
+              <w:t>20.000.000 đ/KH</w:t>
             </w:r>
           </w:p>
         </w:tc>
@@ -15950,12 +16010,15 @@
               <w:rPr>
                 <w:sz w:val="17"/>
               </w:rPr>
-              <w:t>Giả thiết.</w:t>
+              <w:t>Giả thiết, khoảng 25% CASA bình quân duy trì của nhóm CASA cao.</w:t>
             </w:r>
           </w:p>
         </w:tc>
       </w:tr>
       <w:tr>
+        <w:trPr>
+          <w:cantSplit/>
+        </w:trPr>
         <w:tc>
           <w:tcPr>
             <w:tcW w:w="3500" w:type="dxa"/>
@@ -15982,7 +16045,7 @@
                 <w:b/>
                 <w:sz w:val="17"/>
               </w:rPr>
-              <w:t>Biên lãi ròng cho vay thấu chi</w:t>
+              <w:t>Tỷ lệ sử dụng hạn mức thấu chi bình quân</w:t>
             </w:r>
           </w:p>
         </w:tc>
@@ -16012,7 +16075,7 @@
               <w:rPr>
                 <w:sz w:val="17"/>
               </w:rPr>
-              <w:t>5,0%/năm</w:t>
+              <w:t>40,0%</w:t>
             </w:r>
           </w:p>
         </w:tc>
@@ -16042,12 +16105,15 @@
               <w:rPr>
                 <w:sz w:val="17"/>
               </w:rPr>
-              <w:t>Chênh lệch lãi suất cho vay thấu chi và chi phí vốn.</w:t>
+              <w:t>Giả thiết.</w:t>
             </w:r>
           </w:p>
         </w:tc>
       </w:tr>
       <w:tr>
+        <w:trPr>
+          <w:cantSplit/>
+        </w:trPr>
         <w:tc>
           <w:tcPr>
             <w:tcW w:w="3500" w:type="dxa"/>
@@ -16074,7 +16140,7 @@
                 <w:b/>
                 <w:sz w:val="17"/>
               </w:rPr>
-              <w:t>Chi phí e-voucher số đẹp</w:t>
+              <w:t>Biên lãi ròng cho vay thấu chi (NIM cho vay)</w:t>
             </w:r>
           </w:p>
         </w:tc>
@@ -16104,7 +16170,7 @@
               <w:rPr>
                 <w:sz w:val="17"/>
               </w:rPr>
-              <w:t>160.000 đ/voucher</w:t>
+              <w:t>5,0%/năm</w:t>
             </w:r>
           </w:p>
         </w:tc>
@@ -16134,12 +16200,15 @@
               <w:rPr>
                 <w:sz w:val="17"/>
               </w:rPr>
-              <w:t>20% x giá số đẹp bình quân khoảng 800.000 đồng.</w:t>
+              <w:t>Giả thiết, bằng chênh lệch lãi suất cho vay thấu chi và chi phí vốn.</w:t>
             </w:r>
           </w:p>
         </w:tc>
       </w:tr>
       <w:tr>
+        <w:trPr>
+          <w:cantSplit/>
+        </w:trPr>
         <w:tc>
           <w:tcPr>
             <w:tcW w:w="3500" w:type="dxa"/>
@@ -16166,7 +16235,7 @@
                 <w:b/>
                 <w:sz w:val="17"/>
               </w:rPr>
-              <w:t>Tỷ lệ KH mới chọn mua số đẹp - Bước 0</w:t>
+              <w:t>Chi phí e-voucher số đẹp (20% giá số đẹp)</w:t>
             </w:r>
           </w:p>
         </w:tc>
@@ -16196,7 +16265,7 @@
               <w:rPr>
                 <w:sz w:val="17"/>
               </w:rPr>
-              <w:t>15,0%</w:t>
+              <w:t>160.000 đ/voucher</w:t>
             </w:r>
           </w:p>
         </w:tc>
@@ -16226,12 +16295,15 @@
               <w:rPr>
                 <w:sz w:val="17"/>
               </w:rPr>
-              <w:t>72.635 tài khoản có thu phí trong 6 tháng đầu năm.</w:t>
+              <w:t>Giả thiết: 20% × giá số đẹp bình quân khoảng 800.000 đồng; giá trị thực tế có thể xác định theo size bình quân thu phí TKSĐ thực tế 6T/2026.</w:t>
             </w:r>
           </w:p>
         </w:tc>
       </w:tr>
       <w:tr>
+        <w:trPr>
+          <w:cantSplit/>
+        </w:trPr>
         <w:tc>
           <w:tcPr>
             <w:tcW w:w="3500" w:type="dxa"/>
@@ -16258,6 +16330,101 @@
                 <w:b/>
                 <w:sz w:val="17"/>
               </w:rPr>
+              <w:t>Tỷ lệ KH mới chọn mua số đẹp - Bước 0</w:t>
+            </w:r>
+          </w:p>
+        </w:tc>
+        <w:tc>
+          <w:tcPr>
+            <w:tcW w:w="1900" w:type="dxa"/>
+            <w:tcBorders>
+              <w:top w:val="single" w:sz="4" w:space="0" w:color="D2D8E1"/>
+              <w:left w:val="single" w:sz="4" w:space="0" w:color="D2D8E1"/>
+              <w:bottom w:val="single" w:sz="4" w:space="0" w:color="D2D8E1"/>
+              <w:right w:val="single" w:sz="4" w:space="0" w:color="D2D8E1"/>
+            </w:tcBorders>
+            <w:tcMar>
+              <w:top w:w="80" w:type="dxa"/>
+              <w:left w:w="120" w:type="dxa"/>
+              <w:bottom w:w="80" w:type="dxa"/>
+              <w:right w:w="120" w:type="dxa"/>
+            </w:tcMar>
+            <w:vAlign w:val="center"/>
+          </w:tcPr>
+          <w:p>
+            <w:pPr>
+              <w:spacing w:after="0" w:line="264" w:lineRule="auto"/>
+              <w:jc w:val="center"/>
+            </w:pPr>
+            <w:r>
+              <w:rPr>
+                <w:sz w:val="17"/>
+              </w:rPr>
+              <w:t>15,0%</w:t>
+            </w:r>
+          </w:p>
+        </w:tc>
+        <w:tc>
+          <w:tcPr>
+            <w:tcW w:w="3960" w:type="dxa"/>
+            <w:tcBorders>
+              <w:top w:val="single" w:sz="4" w:space="0" w:color="D2D8E1"/>
+              <w:left w:val="single" w:sz="4" w:space="0" w:color="D2D8E1"/>
+              <w:bottom w:val="single" w:sz="4" w:space="0" w:color="D2D8E1"/>
+              <w:right w:val="single" w:sz="4" w:space="0" w:color="D2D8E1"/>
+            </w:tcBorders>
+            <w:tcMar>
+              <w:top w:w="80" w:type="dxa"/>
+              <w:left w:w="120" w:type="dxa"/>
+              <w:bottom w:w="80" w:type="dxa"/>
+              <w:right w:w="120" w:type="dxa"/>
+            </w:tcMar>
+            <w:vAlign w:val="center"/>
+          </w:tcPr>
+          <w:p>
+            <w:pPr>
+              <w:spacing w:after="0" w:line="264" w:lineRule="auto"/>
+              <w:jc w:val="center"/>
+            </w:pPr>
+            <w:r>
+              <w:rPr>
+                <w:sz w:val="17"/>
+              </w:rPr>
+              <w:t>Tỷ lệ số tài khoản có thu phí/tổng số lượng TKSĐ: 72.635 tài khoản trong 6 tháng đầu năm.</w:t>
+            </w:r>
+          </w:p>
+        </w:tc>
+      </w:tr>
+      <w:tr>
+        <w:trPr>
+          <w:cantSplit/>
+        </w:trPr>
+        <w:tc>
+          <w:tcPr>
+            <w:tcW w:w="3500" w:type="dxa"/>
+            <w:tcBorders>
+              <w:top w:val="single" w:sz="4" w:space="0" w:color="D2D8E1"/>
+              <w:left w:val="single" w:sz="4" w:space="0" w:color="D2D8E1"/>
+              <w:bottom w:val="single" w:sz="4" w:space="0" w:color="D2D8E1"/>
+              <w:right w:val="single" w:sz="4" w:space="0" w:color="D2D8E1"/>
+            </w:tcBorders>
+            <w:tcMar>
+              <w:top w:w="80" w:type="dxa"/>
+              <w:left w:w="120" w:type="dxa"/>
+              <w:bottom w:w="80" w:type="dxa"/>
+              <w:right w:w="120" w:type="dxa"/>
+            </w:tcMar>
+            <w:vAlign w:val="center"/>
+          </w:tcPr>
+          <w:p>
+            <w:pPr>
+              <w:spacing w:after="0" w:line="264" w:lineRule="auto"/>
+            </w:pPr>
+            <w:r>
+              <w:rPr>
+                <w:b/>
+                <w:sz w:val="17"/>
+              </w:rPr>
               <w:t>Thu phí TKSĐ bình quân/KH</w:t>
             </w:r>
           </w:p>
@@ -16288,7 +16455,7 @@
               <w:rPr>
                 <w:sz w:val="17"/>
               </w:rPr>
-              <w:t>640.000 đồng</w:t>
+              <w:t>640.000 đ/KH</w:t>
             </w:r>
           </w:p>
         </w:tc>
@@ -16334,12 +16501,12 @@
           <w:rFonts w:ascii="Calibri" w:eastAsia="Calibri" w:hAnsi="Calibri"/>
         </w:rPr>
         <w:lastRenderedPageBreak/>
-        <w:t>Slide 26 — Dự phóng kết quả kinh doanh theo tháng (T8/2026-T12/2026)</w:t>
+        <w:t>Slide 26 — Dự phóng KPI vận hành và P&amp;L tăng thêm (T8/2026–T12/2026)</w:t>
       </w:r>
     </w:p>
     <w:p>
       <w:r>
-        <w:t>Bảng nguồn hiển thị các cột T9/26, T10/26, T11/26, T12/26 và Tổng T9-T12/2026.</w:t>
+        <w:t>T8/2026 là tháng bắt đầu phạm vi dự phóng theo tiêu đề nguồn; bảng chi tiết hiển thị số liệu phát sinh từ T9/2026 đến T12/2026. Đơn vị: VND, trừ các dòng số lượng KH/SP. Với chỉ tiêu tồn lượng hoặc lũy kế, giá trị cuối kỳ được giữ riêng, không cộng dồn như dòng phát sinh.</w:t>
       </w:r>
     </w:p>
     <w:p>
@@ -16350,7 +16517,7 @@
         <w:rPr>
           <w:rFonts w:ascii="Calibri" w:eastAsia="Calibri" w:hAnsi="Calibri"/>
         </w:rPr>
-        <w:t>A. Quy mô khách hàng và sản phẩm</w:t>
+        <w:t>A. Quy mô khách hàng và sản phẩm (Operational Volume)</w:t>
       </w:r>
     </w:p>
     <w:p>
@@ -16372,6 +16539,7 @@
       </w:tblGrid>
       <w:tr>
         <w:trPr>
+          <w:cantSplit/>
           <w:tblHeader/>
         </w:trPr>
         <w:tc>
@@ -16403,7 +16571,7 @@
                 <w:color w:val="0B2545"/>
                 <w:sz w:val="17"/>
               </w:rPr>
-              <w:t>Chỉ tiêu</w:t>
+              <w:t>KPI vận hành / chỉ tiêu quy mô</w:t>
             </w:r>
           </w:p>
         </w:tc>
@@ -16436,12 +16604,15 @@
                 <w:color w:val="0B2545"/>
                 <w:sz w:val="17"/>
               </w:rPr>
-              <w:t>Theo kỳ</w:t>
+              <w:t>T9/26 → T12/26; Tổng T9–T12/2026</w:t>
             </w:r>
           </w:p>
         </w:tc>
       </w:tr>
       <w:tr>
+        <w:trPr>
+          <w:cantSplit/>
+        </w:trPr>
         <w:tc>
           <w:tcPr>
             <w:tcW w:w="3900" w:type="dxa"/>
@@ -16468,7 +16639,7 @@
                 <w:b/>
                 <w:sz w:val="17"/>
               </w:rPr>
-              <w:t>Tổng KH trong chương trình (lũy kế)</w:t>
+              <w:t>Tổng KH lũy kế là đối tượng tiếp cận chương trình</w:t>
             </w:r>
           </w:p>
         </w:tc>
@@ -16497,12 +16668,15 @@
               <w:rPr>
                 <w:sz w:val="17"/>
               </w:rPr>
-              <w:t>T9 77.566; T10 104.851; T11 132.137; T12 159.423; Tổng 473.977</w:t>
+              <w:t>T9 220.073; T10 272.545; T11 325.018; T12 377.490; Giá trị cột tổng nguồn: 482.435</w:t>
             </w:r>
           </w:p>
         </w:tc>
       </w:tr>
       <w:tr>
+        <w:trPr>
+          <w:cantSplit/>
+        </w:trPr>
         <w:tc>
           <w:tcPr>
             <w:tcW w:w="3900" w:type="dxa"/>
@@ -16529,7 +16703,7 @@
                 <w:b/>
                 <w:sz w:val="17"/>
               </w:rPr>
-              <w:t>SP mới: Auto Billing đăng ký thêm</w:t>
+              <w:t>Tổng KH tham gia trong chương trình (lũy kế)</w:t>
             </w:r>
           </w:p>
         </w:tc>
@@ -16558,12 +16732,15 @@
               <w:rPr>
                 <w:sz w:val="17"/>
               </w:rPr>
-              <w:t>T9 3.103; T10 3.418; T11 5.788; T12 7.153; Tổng 19.462</w:t>
+              <w:t>T9 77.566; T10 104.851; T11 132.137; T12 159.423; Giá trị cuối kỳ T12: 159.423</w:t>
             </w:r>
           </w:p>
         </w:tc>
       </w:tr>
       <w:tr>
+        <w:trPr>
+          <w:cantSplit/>
+        </w:trPr>
         <w:tc>
           <w:tcPr>
             <w:tcW w:w="3900" w:type="dxa"/>
@@ -16590,7 +16767,7 @@
                 <w:b/>
                 <w:sz w:val="17"/>
               </w:rPr>
-              <w:t>SP mới: Sổ tiết kiệm ưu đãi</w:t>
+              <w:t>SP mới: Auto Billing đăng ký thêm trong tháng</w:t>
             </w:r>
           </w:p>
         </w:tc>
@@ -16619,12 +16796,15 @@
               <w:rPr>
                 <w:sz w:val="17"/>
               </w:rPr>
-              <w:t>T9 17.789; T10 8.273; T11 7.583; T12 8.123; Tổng 41.767</w:t>
+              <w:t>T9 3.103; T10 3.418; T11 5.788; T12 7.153; Tổng 19.462</w:t>
             </w:r>
           </w:p>
         </w:tc>
       </w:tr>
       <w:tr>
+        <w:trPr>
+          <w:cantSplit/>
+        </w:trPr>
         <w:tc>
           <w:tcPr>
             <w:tcW w:w="3900" w:type="dxa"/>
@@ -16651,7 +16831,7 @@
                 <w:b/>
                 <w:sz w:val="17"/>
               </w:rPr>
-              <w:t>SP mới: Hợp đồng bảo hiểm PNT</w:t>
+              <w:t>SP mới: Sổ tiết kiệm ưu đãi mở thêm trong tháng</w:t>
             </w:r>
           </w:p>
         </w:tc>
@@ -16680,12 +16860,15 @@
               <w:rPr>
                 <w:sz w:val="17"/>
               </w:rPr>
-              <w:t>T9 388; T10 912; T11 1.573; T12 1.982; Tổng 4.855</w:t>
+              <w:t>T9 17.789; T10 8.273; T11 7.583; T12 8.123; Tổng 41.767</w:t>
             </w:r>
           </w:p>
         </w:tc>
       </w:tr>
       <w:tr>
+        <w:trPr>
+          <w:cantSplit/>
+        </w:trPr>
         <w:tc>
           <w:tcPr>
             <w:tcW w:w="3900" w:type="dxa"/>
@@ -16712,7 +16895,7 @@
                 <w:b/>
                 <w:sz w:val="17"/>
               </w:rPr>
-              <w:t>SP mới: TK chứng khoán SHS</w:t>
+              <w:t>SP mới: Hợp đồng bảo hiểm PNT bán thêm trong tháng</w:t>
             </w:r>
           </w:p>
         </w:tc>
@@ -16741,12 +16924,15 @@
               <w:rPr>
                 <w:sz w:val="17"/>
               </w:rPr>
-              <w:t>T9 776; T10 1.824; T11 2.758; T12 3.440; Tổng 8.797</w:t>
+              <w:t>T9 388; T10 912; T11 1.573; T12 1.982; Tổng 4.855</w:t>
             </w:r>
           </w:p>
         </w:tc>
       </w:tr>
       <w:tr>
+        <w:trPr>
+          <w:cantSplit/>
+        </w:trPr>
         <w:tc>
           <w:tcPr>
             <w:tcW w:w="3900" w:type="dxa"/>
@@ -16773,7 +16959,7 @@
                 <w:b/>
                 <w:sz w:val="17"/>
               </w:rPr>
-              <w:t>SP mới: Thẻ tín dụng</w:t>
+              <w:t>SP mới: Tài khoản chứng khoán SHS mở thêm trong tháng</w:t>
             </w:r>
           </w:p>
         </w:tc>
@@ -16802,12 +16988,15 @@
               <w:rPr>
                 <w:sz w:val="17"/>
               </w:rPr>
-              <w:t>T9 -; T10 -; T11 3.878; T12 1.364; Tổng 5.243</w:t>
+              <w:t>T9 776; T10 1.824; T11 2.758; T12 3.440; Tổng 8.797</w:t>
             </w:r>
           </w:p>
         </w:tc>
       </w:tr>
       <w:tr>
+        <w:trPr>
+          <w:cantSplit/>
+        </w:trPr>
         <w:tc>
           <w:tcPr>
             <w:tcW w:w="3900" w:type="dxa"/>
@@ -16834,7 +17023,7 @@
                 <w:b/>
                 <w:sz w:val="17"/>
               </w:rPr>
-              <w:t>SP mới: HĐ thấu chi sổ TK</w:t>
+              <w:t>SP mới: Thẻ tín dụng mở thêm trong tháng</w:t>
             </w:r>
           </w:p>
         </w:tc>
@@ -16863,12 +17052,15 @@
               <w:rPr>
                 <w:sz w:val="17"/>
               </w:rPr>
-              <w:t>T9 -; T10 -; T11 -; T12 -; Tổng -</w:t>
+              <w:t>T9 -; T10 -; T11 3.878; T12 1.364; Tổng 5.243</w:t>
             </w:r>
           </w:p>
         </w:tc>
       </w:tr>
       <w:tr>
+        <w:trPr>
+          <w:cantSplit/>
+        </w:trPr>
         <w:tc>
           <w:tcPr>
             <w:tcW w:w="3900" w:type="dxa"/>
@@ -16895,7 +17087,7 @@
                 <w:b/>
                 <w:sz w:val="17"/>
               </w:rPr>
-              <w:t>Tổng SP/DV tăng thêm trong tháng</w:t>
+              <w:t>SP mới: HĐ thấu chi sổ TK mở thêm trong tháng</w:t>
             </w:r>
           </w:p>
         </w:tc>
@@ -16924,12 +17116,15 @@
               <w:rPr>
                 <w:sz w:val="17"/>
               </w:rPr>
-              <w:t>T9 22.055; T10 14.427; T11 21.580; T12 22.062; Tổng 80.124</w:t>
+              <w:t>T9 -; T10 -; T11 -; T12 -; Tổng -</w:t>
             </w:r>
           </w:p>
         </w:tc>
       </w:tr>
       <w:tr>
+        <w:trPr>
+          <w:cantSplit/>
+        </w:trPr>
         <w:tc>
           <w:tcPr>
             <w:tcW w:w="3900" w:type="dxa"/>
@@ -16956,6 +17151,70 @@
                 <w:b/>
                 <w:sz w:val="17"/>
               </w:rPr>
+              <w:t>Tổng SP/DV tăng thêm trong tháng</w:t>
+            </w:r>
+          </w:p>
+        </w:tc>
+        <w:tc>
+          <w:tcPr>
+            <w:tcW w:w="5460" w:type="dxa"/>
+            <w:tcBorders>
+              <w:top w:val="single" w:sz="4" w:space="0" w:color="D2D8E1"/>
+              <w:left w:val="single" w:sz="4" w:space="0" w:color="D2D8E1"/>
+              <w:bottom w:val="single" w:sz="4" w:space="0" w:color="D2D8E1"/>
+              <w:right w:val="single" w:sz="4" w:space="0" w:color="D2D8E1"/>
+            </w:tcBorders>
+            <w:tcMar>
+              <w:top w:w="80" w:type="dxa"/>
+              <w:left w:w="120" w:type="dxa"/>
+              <w:bottom w:w="80" w:type="dxa"/>
+              <w:right w:w="120" w:type="dxa"/>
+            </w:tcMar>
+            <w:vAlign w:val="center"/>
+          </w:tcPr>
+          <w:p>
+            <w:pPr>
+              <w:spacing w:after="0" w:line="264" w:lineRule="auto"/>
+            </w:pPr>
+            <w:r>
+              <w:rPr>
+                <w:sz w:val="17"/>
+              </w:rPr>
+              <w:t>T9 22.055; T10 14.427; T11 21.580; T12 22.062; Tổng 80.124</w:t>
+            </w:r>
+          </w:p>
+        </w:tc>
+      </w:tr>
+      <w:tr>
+        <w:trPr>
+          <w:cantSplit/>
+        </w:trPr>
+        <w:tc>
+          <w:tcPr>
+            <w:tcW w:w="3900" w:type="dxa"/>
+            <w:tcBorders>
+              <w:top w:val="single" w:sz="4" w:space="0" w:color="D2D8E1"/>
+              <w:left w:val="single" w:sz="4" w:space="0" w:color="D2D8E1"/>
+              <w:bottom w:val="single" w:sz="4" w:space="0" w:color="D2D8E1"/>
+              <w:right w:val="single" w:sz="4" w:space="0" w:color="D2D8E1"/>
+            </w:tcBorders>
+            <w:tcMar>
+              <w:top w:w="80" w:type="dxa"/>
+              <w:left w:w="120" w:type="dxa"/>
+              <w:bottom w:w="80" w:type="dxa"/>
+              <w:right w:w="120" w:type="dxa"/>
+            </w:tcMar>
+            <w:vAlign w:val="center"/>
+          </w:tcPr>
+          <w:p>
+            <w:pPr>
+              <w:spacing w:after="0" w:line="264" w:lineRule="auto"/>
+            </w:pPr>
+            <w:r>
+              <w:rPr>
+                <w:b/>
+                <w:sz w:val="17"/>
+              </w:rPr>
               <w:t>Lũy kế tổng SP/DV tăng thêm</w:t>
             </w:r>
           </w:p>
@@ -16985,7 +17244,135 @@
               <w:rPr>
                 <w:sz w:val="17"/>
               </w:rPr>
-              <w:t>T9 22.055; T10 36.482; T11 58.062; T12 80.124; Tổng 196.723</w:t>
+              <w:t>T9 22.055; T10 36.482; T11 58.062; T12 80.124; Tổng theo cột nguồn 196.723; giá trị cuối kỳ T12 80.124</w:t>
+            </w:r>
+          </w:p>
+        </w:tc>
+      </w:tr>
+      <w:tr>
+        <w:trPr>
+          <w:cantSplit/>
+        </w:trPr>
+        <w:tc>
+          <w:tcPr>
+            <w:tcW w:w="3900" w:type="dxa"/>
+            <w:tcBorders>
+              <w:top w:val="single" w:sz="4" w:space="0" w:color="D2D8E1"/>
+              <w:left w:val="single" w:sz="4" w:space="0" w:color="D2D8E1"/>
+              <w:bottom w:val="single" w:sz="4" w:space="0" w:color="D2D8E1"/>
+              <w:right w:val="single" w:sz="4" w:space="0" w:color="D2D8E1"/>
+            </w:tcBorders>
+            <w:tcMar>
+              <w:top w:w="80" w:type="dxa"/>
+              <w:left w:w="120" w:type="dxa"/>
+              <w:bottom w:w="80" w:type="dxa"/>
+              <w:right w:w="120" w:type="dxa"/>
+            </w:tcMar>
+            <w:vAlign w:val="center"/>
+          </w:tcPr>
+          <w:p>
+            <w:pPr>
+              <w:spacing w:after="0" w:line="264" w:lineRule="auto"/>
+            </w:pPr>
+            <w:r>
+              <w:rPr>
+                <w:b/>
+                <w:sz w:val="17"/>
+              </w:rPr>
+              <w:t>Số lượng SPDV bình quân/KH với full tập KH mới</w:t>
+            </w:r>
+          </w:p>
+        </w:tc>
+        <w:tc>
+          <w:tcPr>
+            <w:tcW w:w="5460" w:type="dxa"/>
+            <w:tcBorders>
+              <w:top w:val="single" w:sz="4" w:space="0" w:color="D2D8E1"/>
+              <w:left w:val="single" w:sz="4" w:space="0" w:color="D2D8E1"/>
+              <w:bottom w:val="single" w:sz="4" w:space="0" w:color="D2D8E1"/>
+              <w:right w:val="single" w:sz="4" w:space="0" w:color="D2D8E1"/>
+            </w:tcBorders>
+            <w:tcMar>
+              <w:top w:w="80" w:type="dxa"/>
+              <w:left w:w="120" w:type="dxa"/>
+              <w:bottom w:w="80" w:type="dxa"/>
+              <w:right w:w="120" w:type="dxa"/>
+            </w:tcMar>
+            <w:vAlign w:val="center"/>
+          </w:tcPr>
+          <w:p>
+            <w:pPr>
+              <w:spacing w:after="0" w:line="264" w:lineRule="auto"/>
+            </w:pPr>
+            <w:r>
+              <w:rPr>
+                <w:sz w:val="17"/>
+              </w:rPr>
+              <w:t>T9 1,90; T10 1,94; T11 2,06; T12 2,12; Giá trị cuối kỳ 2,12</w:t>
+            </w:r>
+          </w:p>
+        </w:tc>
+      </w:tr>
+      <w:tr>
+        <w:trPr>
+          <w:cantSplit/>
+        </w:trPr>
+        <w:tc>
+          <w:tcPr>
+            <w:tcW w:w="3900" w:type="dxa"/>
+            <w:tcBorders>
+              <w:top w:val="single" w:sz="4" w:space="0" w:color="D2D8E1"/>
+              <w:left w:val="single" w:sz="4" w:space="0" w:color="D2D8E1"/>
+              <w:bottom w:val="single" w:sz="4" w:space="0" w:color="D2D8E1"/>
+              <w:right w:val="single" w:sz="4" w:space="0" w:color="D2D8E1"/>
+            </w:tcBorders>
+            <w:tcMar>
+              <w:top w:w="80" w:type="dxa"/>
+              <w:left w:w="120" w:type="dxa"/>
+              <w:bottom w:w="80" w:type="dxa"/>
+              <w:right w:w="120" w:type="dxa"/>
+            </w:tcMar>
+            <w:vAlign w:val="center"/>
+          </w:tcPr>
+          <w:p>
+            <w:pPr>
+              <w:spacing w:after="0" w:line="264" w:lineRule="auto"/>
+            </w:pPr>
+            <w:r>
+              <w:rPr>
+                <w:b/>
+                <w:sz w:val="17"/>
+              </w:rPr>
+              <w:t>Số lượng SPDV bình quân/KH với tập KH tham gia chương trình</w:t>
+            </w:r>
+          </w:p>
+        </w:tc>
+        <w:tc>
+          <w:tcPr>
+            <w:tcW w:w="5460" w:type="dxa"/>
+            <w:tcBorders>
+              <w:top w:val="single" w:sz="4" w:space="0" w:color="D2D8E1"/>
+              <w:left w:val="single" w:sz="4" w:space="0" w:color="D2D8E1"/>
+              <w:bottom w:val="single" w:sz="4" w:space="0" w:color="D2D8E1"/>
+              <w:right w:val="single" w:sz="4" w:space="0" w:color="D2D8E1"/>
+            </w:tcBorders>
+            <w:tcMar>
+              <w:top w:w="80" w:type="dxa"/>
+              <w:left w:w="120" w:type="dxa"/>
+              <w:bottom w:w="80" w:type="dxa"/>
+              <w:right w:w="120" w:type="dxa"/>
+            </w:tcMar>
+            <w:vAlign w:val="center"/>
+          </w:tcPr>
+          <w:p>
+            <w:pPr>
+              <w:spacing w:after="0" w:line="264" w:lineRule="auto"/>
+            </w:pPr>
+            <w:r>
+              <w:rPr>
+                <w:sz w:val="17"/>
+              </w:rPr>
+              <w:t>T9 2,41; T10 2,46; T11 2,58; T12 2,61; Giá trị cuối kỳ 2,61</w:t>
             </w:r>
           </w:p>
         </w:tc>
@@ -16999,7 +17386,7 @@
         <w:rPr>
           <w:rFonts w:ascii="Calibri" w:eastAsia="Calibri" w:hAnsi="Calibri"/>
         </w:rPr>
-        <w:t>B. CASA tăng thêm và thu nhập</w:t>
+        <w:t>B. CASA và thu nhập tăng thêm (Incremental Revenue)</w:t>
       </w:r>
     </w:p>
     <w:p>
@@ -17021,6 +17408,7 @@
       </w:tblGrid>
       <w:tr>
         <w:trPr>
+          <w:cantSplit/>
           <w:tblHeader/>
         </w:trPr>
         <w:tc>
@@ -17052,7 +17440,7 @@
                 <w:color w:val="0B2545"/>
                 <w:sz w:val="17"/>
               </w:rPr>
-              <w:t>Chỉ tiêu</w:t>
+              <w:t>Chỉ tiêu CASA và thu nhập tăng thêm</w:t>
             </w:r>
           </w:p>
         </w:tc>
@@ -17085,12 +17473,15 @@
                 <w:color w:val="0B2545"/>
                 <w:sz w:val="17"/>
               </w:rPr>
-              <w:t>Theo kỳ</w:t>
+              <w:t>T9/26 → T12/26; Tổng T9–T12/2026</w:t>
             </w:r>
           </w:p>
         </w:tc>
       </w:tr>
       <w:tr>
+        <w:trPr>
+          <w:cantSplit/>
+        </w:trPr>
         <w:tc>
           <w:tcPr>
             <w:tcW w:w="3900" w:type="dxa"/>
@@ -17146,12 +17537,15 @@
               <w:rPr>
                 <w:sz w:val="17"/>
               </w:rPr>
-              <w:t>T9 2.171.839.687; T10 4.564.719.139; T11 8.616.518.200; T12 13.623.316.869; Tổng 13.623.316.869</w:t>
+              <w:t>T9 2.171.839.687; T10 15.084.000.000; T11 31.886.229.131; T12 45.078.738.732; Giá trị cuối kỳ T12 45.078.738.732</w:t>
             </w:r>
           </w:p>
         </w:tc>
       </w:tr>
       <w:tr>
+        <w:trPr>
+          <w:cantSplit/>
+        </w:trPr>
         <w:tc>
           <w:tcPr>
             <w:tcW w:w="3900" w:type="dxa"/>
@@ -17178,7 +17572,7 @@
                 <w:b/>
                 <w:sz w:val="17"/>
               </w:rPr>
-              <w:t>Thu thuần NIM CASA</w:t>
+              <w:t>Thu thuần NIM CASA trong tháng</w:t>
             </w:r>
           </w:p>
         </w:tc>
@@ -17207,12 +17601,15 @@
               <w:rPr>
                 <w:sz w:val="17"/>
               </w:rPr>
-              <w:t>T9 7.239.466; T10 15.215.730; T11 28.721.727; T12 45.411.056; Tổng 96.587.980</w:t>
+              <w:t>T9 7.239.466; T10 50.280.000; T11 106.287.430; T12 150.262.462; Tổng 314.069.358</w:t>
             </w:r>
           </w:p>
         </w:tc>
       </w:tr>
       <w:tr>
+        <w:trPr>
+          <w:cantSplit/>
+        </w:trPr>
         <w:tc>
           <w:tcPr>
             <w:tcW w:w="3900" w:type="dxa"/>
@@ -17239,7 +17636,8 @@
                 <w:b/>
                 <w:sz w:val="17"/>
               </w:rPr>
-              <w:t>Thu thuần TGCKH</w:t>
+              <w:lastRenderedPageBreak/>
+              <w:t>Thu thuần TGCKH trong tháng</w:t>
             </w:r>
           </w:p>
         </w:tc>
@@ -17274,6 +17672,9 @@
         </w:tc>
       </w:tr>
       <w:tr>
+        <w:trPr>
+          <w:cantSplit/>
+        </w:trPr>
         <w:tc>
           <w:tcPr>
             <w:tcW w:w="3900" w:type="dxa"/>
@@ -17300,7 +17701,7 @@
                 <w:b/>
                 <w:sz w:val="17"/>
               </w:rPr>
-              <w:t>Thu phí giao dịch thẻ tín dụng</w:t>
+              <w:t>Thu phí giao dịch thẻ tín dụng trong tháng</w:t>
             </w:r>
           </w:p>
         </w:tc>
@@ -17335,6 +17736,9 @@
         </w:tc>
       </w:tr>
       <w:tr>
+        <w:trPr>
+          <w:cantSplit/>
+        </w:trPr>
         <w:tc>
           <w:tcPr>
             <w:tcW w:w="3900" w:type="dxa"/>
@@ -17361,7 +17765,7 @@
                 <w:b/>
                 <w:sz w:val="17"/>
               </w:rPr>
-              <w:t>Thu hoa hồng bảo hiểm PNT</w:t>
+              <w:t>Thu hoa hồng bảo hiểm phi nhân thọ trong tháng</w:t>
             </w:r>
           </w:p>
         </w:tc>
@@ -17396,6 +17800,9 @@
         </w:tc>
       </w:tr>
       <w:tr>
+        <w:trPr>
+          <w:cantSplit/>
+        </w:trPr>
         <w:tc>
           <w:tcPr>
             <w:tcW w:w="3900" w:type="dxa"/>
@@ -17422,7 +17829,7 @@
                 <w:b/>
                 <w:sz w:val="17"/>
               </w:rPr>
-              <w:t>Thu chia sẻ doanh thu chứng khoán SHS</w:t>
+              <w:t>Thu chia sẻ doanh thu chứng khoán SHS trong tháng</w:t>
             </w:r>
           </w:p>
         </w:tc>
@@ -17457,6 +17864,9 @@
         </w:tc>
       </w:tr>
       <w:tr>
+        <w:trPr>
+          <w:cantSplit/>
+        </w:trPr>
         <w:tc>
           <w:tcPr>
             <w:tcW w:w="3900" w:type="dxa"/>
@@ -17483,7 +17893,7 @@
                 <w:b/>
                 <w:sz w:val="17"/>
               </w:rPr>
-              <w:t>Thu phí TKSĐ</w:t>
+              <w:t>Thu phí TKSĐ trong tháng</w:t>
             </w:r>
           </w:p>
         </w:tc>
@@ -17518,6 +17928,9 @@
         </w:tc>
       </w:tr>
       <w:tr>
+        <w:trPr>
+          <w:cantSplit/>
+        </w:trPr>
         <w:tc>
           <w:tcPr>
             <w:tcW w:w="3900" w:type="dxa"/>
@@ -17544,7 +17957,7 @@
                 <w:b/>
                 <w:sz w:val="17"/>
               </w:rPr>
-              <w:t>Thu lãi cho vay thấu chi</w:t>
+              <w:t>Thu lãi cho vay thấu chi trong tháng</w:t>
             </w:r>
           </w:p>
         </w:tc>
@@ -17579,6 +17992,9 @@
         </w:tc>
       </w:tr>
       <w:tr>
+        <w:trPr>
+          <w:cantSplit/>
+        </w:trPr>
         <w:tc>
           <w:tcPr>
             <w:tcW w:w="3900" w:type="dxa"/>
@@ -17634,14 +18050,7 @@
               <w:rPr>
                 <w:sz w:val="17"/>
               </w:rPr>
-              <w:t xml:space="preserve">T9 3.115.121.129; T10 3.520.483.259; T11 4.111.513.931; T12 </w:t>
-            </w:r>
-            <w:r>
-              <w:rPr>
-                <w:sz w:val="17"/>
-              </w:rPr>
-              <w:lastRenderedPageBreak/>
-              <w:t>4.509.843.010; Tổng 15.256.961.329</w:t>
+              <w:t>T9 3.115.121.129; T10 3.555.547.528; T11 4.189.079.634; T12 4.614.694.417; Tổng 15.474.442.708</w:t>
             </w:r>
           </w:p>
         </w:tc>
@@ -17655,8 +18064,7 @@
         <w:rPr>
           <w:rFonts w:ascii="Calibri" w:eastAsia="Calibri" w:hAnsi="Calibri"/>
         </w:rPr>
-        <w:lastRenderedPageBreak/>
-        <w:t>C. Chi phí</w:t>
+        <w:t>C. Chi phí tăng thêm (Incremental Costs)</w:t>
       </w:r>
     </w:p>
     <w:p>
@@ -17678,6 +18086,7 @@
       </w:tblGrid>
       <w:tr>
         <w:trPr>
+          <w:cantSplit/>
           <w:tblHeader/>
         </w:trPr>
         <w:tc>
@@ -17709,7 +18118,7 @@
                 <w:color w:val="0B2545"/>
                 <w:sz w:val="17"/>
               </w:rPr>
-              <w:t>Chỉ tiêu</w:t>
+              <w:t>Chỉ tiêu chi phí</w:t>
             </w:r>
           </w:p>
         </w:tc>
@@ -17742,12 +18151,15 @@
                 <w:color w:val="0B2545"/>
                 <w:sz w:val="17"/>
               </w:rPr>
-              <w:t>Theo kỳ</w:t>
+              <w:t>T9/26 → T12/26; Tổng T9–T12/2026</w:t>
             </w:r>
           </w:p>
         </w:tc>
       </w:tr>
       <w:tr>
+        <w:trPr>
+          <w:cantSplit/>
+        </w:trPr>
         <w:tc>
           <w:tcPr>
             <w:tcW w:w="3900" w:type="dxa"/>
@@ -17809,6 +18221,9 @@
         </w:tc>
       </w:tr>
       <w:tr>
+        <w:trPr>
+          <w:cantSplit/>
+        </w:trPr>
         <w:tc>
           <w:tcPr>
             <w:tcW w:w="3900" w:type="dxa"/>
@@ -17835,7 +18250,7 @@
                 <w:b/>
                 <w:sz w:val="17"/>
               </w:rPr>
-              <w:t>Chi phí thưởng lãi suất tiết kiệm</w:t>
+              <w:t>Chi phí thưởng lãi suất tiết kiệm - Bước 3a</w:t>
             </w:r>
           </w:p>
         </w:tc>
@@ -17870,6 +18285,9 @@
         </w:tc>
       </w:tr>
       <w:tr>
+        <w:trPr>
+          <w:cantSplit/>
+        </w:trPr>
         <w:tc>
           <w:tcPr>
             <w:tcW w:w="3900" w:type="dxa"/>
@@ -17931,6 +18349,9 @@
         </w:tc>
       </w:tr>
       <w:tr>
+        <w:trPr>
+          <w:cantSplit/>
+        </w:trPr>
         <w:tc>
           <w:tcPr>
             <w:tcW w:w="3900" w:type="dxa"/>
@@ -17992,6 +18413,9 @@
         </w:tc>
       </w:tr>
       <w:tr>
+        <w:trPr>
+          <w:cantSplit/>
+        </w:trPr>
         <w:tc>
           <w:tcPr>
             <w:tcW w:w="3900" w:type="dxa"/>
@@ -18018,7 +18442,7 @@
                 <w:b/>
                 <w:sz w:val="17"/>
               </w:rPr>
-              <w:t>Chi phí quick win one-time</w:t>
+              <w:t>Chi phí triển khai quick win (một lần, ghi nhận T9/2026)</w:t>
             </w:r>
           </w:p>
         </w:tc>
@@ -18053,6 +18477,9 @@
         </w:tc>
       </w:tr>
       <w:tr>
+        <w:trPr>
+          <w:cantSplit/>
+        </w:trPr>
         <w:tc>
           <w:tcPr>
             <w:tcW w:w="3900" w:type="dxa"/>
@@ -18079,7 +18506,7 @@
                 <w:b/>
                 <w:sz w:val="17"/>
               </w:rPr>
-              <w:t>Chi phí nền tảng dài hạn</w:t>
+              <w:t>Chi phí xây dựng hệ thống nền tảng dài hạn</w:t>
             </w:r>
           </w:p>
         </w:tc>
@@ -18114,6 +18541,9 @@
         </w:tc>
       </w:tr>
       <w:tr>
+        <w:trPr>
+          <w:cantSplit/>
+        </w:trPr>
         <w:tc>
           <w:tcPr>
             <w:tcW w:w="3900" w:type="dxa"/>
@@ -18183,7 +18613,7 @@
         <w:rPr>
           <w:rFonts w:ascii="Calibri" w:eastAsia="Calibri" w:hAnsi="Calibri"/>
         </w:rPr>
-        <w:t>D. Hiệu quả ròng</w:t>
+        <w:t>D. Đóng góp ròng tăng thêm (Incremental Contribution)</w:t>
       </w:r>
     </w:p>
     <w:p>
@@ -18205,6 +18635,7 @@
       </w:tblGrid>
       <w:tr>
         <w:trPr>
+          <w:cantSplit/>
           <w:tblHeader/>
         </w:trPr>
         <w:tc>
@@ -18236,7 +18667,7 @@
                 <w:color w:val="0B2545"/>
                 <w:sz w:val="17"/>
               </w:rPr>
-              <w:t>Chỉ tiêu</w:t>
+              <w:t>Chỉ tiêu đóng góp ròng tăng thêm</w:t>
             </w:r>
           </w:p>
         </w:tc>
@@ -18269,12 +18700,15 @@
                 <w:color w:val="0B2545"/>
                 <w:sz w:val="17"/>
               </w:rPr>
-              <w:t>Theo kỳ</w:t>
+              <w:t>T9/26 → T12/26; Tổng T9–T12/2026</w:t>
             </w:r>
           </w:p>
         </w:tc>
       </w:tr>
       <w:tr>
+        <w:trPr>
+          <w:cantSplit/>
+        </w:trPr>
         <w:tc>
           <w:tcPr>
             <w:tcW w:w="3900" w:type="dxa"/>
@@ -18301,7 +18735,7 @@
                 <w:b/>
                 <w:sz w:val="17"/>
               </w:rPr>
-              <w:t>Lợi nhuận ròng trong tháng</w:t>
+              <w:t>Đóng góp ròng tăng thêm trong tháng*</w:t>
             </w:r>
           </w:p>
         </w:tc>
@@ -18330,12 +18764,15 @@
               <w:rPr>
                 <w:sz w:val="17"/>
               </w:rPr>
-              <w:t>T9 2.100.327.018; T10 2.451.900.570; T11 3.104.620.924; T12 3.455.408.470; Tổng 11.112.256.983</w:t>
+              <w:t>T9 2.100.327.018; T10 2.486.964.840; T11 3.182.186.627; T12 3.560.259.876; Tổng 11.329.738.361</w:t>
             </w:r>
           </w:p>
         </w:tc>
       </w:tr>
       <w:tr>
+        <w:trPr>
+          <w:cantSplit/>
+        </w:trPr>
         <w:tc>
           <w:tcPr>
             <w:tcW w:w="3900" w:type="dxa"/>
@@ -18362,7 +18799,7 @@
                 <w:b/>
                 <w:sz w:val="17"/>
               </w:rPr>
-              <w:t>Lợi nhuận ròng lũy kế</w:t>
+              <w:t>Đóng góp ròng tăng thêm lũy kế*</w:t>
             </w:r>
           </w:p>
         </w:tc>
@@ -18391,7 +18828,7 @@
               <w:rPr>
                 <w:sz w:val="17"/>
               </w:rPr>
-              <w:t>T9 2.100.327.018; T10 4.552.227.589; T11 7.656.848.513; T12 11.112.256.983; Tổng 11.112.256.983</w:t>
+              <w:t>T9 2.100.327.018; T10 4.587.291.858; T11 7.769.478.485; T12 11.329.738.361; Giá trị cuối kỳ T12 11.329.738.361</w:t>
             </w:r>
           </w:p>
         </w:tc>
@@ -18407,29 +18844,23 @@
           <w:rFonts w:ascii="Calibri" w:eastAsia="Calibri" w:hAnsi="Calibri"/>
         </w:rPr>
         <w:lastRenderedPageBreak/>
-        <w:t>Slide 27 — Dự phóng kết quả kinh doanh theo tháng (T1/2027-T7/2027)</w:t>
+        <w:t>Slide 27 — Dự phóng KPI vận hành và P&amp;L tăng thêm (T1/2027–T8/2027)</w:t>
       </w:r>
+    </w:p>
+    <w:p>
+      <w:r>
+        <w:t>Giai đoạn T1/2027–T8/2027 hoàn tất chu kỳ 12 tháng T9/2026–T8/2027. Ảnh nguồn ghi tiêu đề T1/2026–T8/2027 nhưng các cột thể hiện T1/27–T8/27; tài liệu chuẩn hóa kỳ theo các cột là T1/2027–T8/2027. Đơn vị: VND, trừ các dòng số lượng KH/SP.</w:t>
+      </w:r>
+    </w:p>
+    <w:p>
+      <w:pPr>
+        <w:pStyle w:val="Heading2"/>
+      </w:pPr>
       <w:r>
         <w:rPr>
           <w:rFonts w:ascii="Calibri" w:eastAsia="Calibri" w:hAnsi="Calibri"/>
         </w:rPr>
-        <w:t xml:space="preserve"> (PnL)</w:t>
-      </w:r>
-    </w:p>
-    <w:p>
-      <w:r>
-        <w:t>Đơn vị: đồng (VND), trừ các dòng số lượng khách hàng/sản phẩm. Toàn bộ số liệu dựa trên giả thiết. Bảng nguồn có các cột T1/27 đến T8/27 và Tổng 12 tháng.</w:t>
-      </w:r>
-    </w:p>
-    <w:p>
-      <w:pPr>
-        <w:pStyle w:val="Heading2"/>
-      </w:pPr>
-      <w:r>
-        <w:rPr>
-          <w:rFonts w:ascii="Calibri" w:eastAsia="Calibri" w:hAnsi="Calibri"/>
-        </w:rPr>
-        <w:t>A. Quy mô khách hàng và sản phẩm</w:t>
+        <w:t>A. Quy mô khách hàng và sản phẩm (Operational Volume)</w:t>
       </w:r>
     </w:p>
     <w:p>
@@ -18451,6 +18882,7 @@
       </w:tblGrid>
       <w:tr>
         <w:trPr>
+          <w:cantSplit/>
           <w:tblHeader/>
         </w:trPr>
         <w:tc>
@@ -18482,7 +18914,7 @@
                 <w:color w:val="0B2545"/>
                 <w:sz w:val="17"/>
               </w:rPr>
-              <w:t>Chỉ tiêu</w:t>
+              <w:t>KPI vận hành / chỉ tiêu quy mô</w:t>
             </w:r>
           </w:p>
         </w:tc>
@@ -18515,12 +18947,15 @@
                 <w:color w:val="0B2545"/>
                 <w:sz w:val="17"/>
               </w:rPr>
-              <w:t>T1/27 -&gt; T8/27; Tổng 12 tháng</w:t>
+              <w:t>T1/27 → T8/27; Tổng chu kỳ 12 tháng T9/2026–T8/2027</w:t>
             </w:r>
           </w:p>
         </w:tc>
       </w:tr>
       <w:tr>
+        <w:trPr>
+          <w:cantSplit/>
+        </w:trPr>
         <w:tc>
           <w:tcPr>
             <w:tcW w:w="3900" w:type="dxa"/>
@@ -18547,7 +18982,7 @@
                 <w:b/>
                 <w:sz w:val="17"/>
               </w:rPr>
-              <w:t>Tổng KH trong chương trình (lũy kế)</w:t>
+              <w:t>Tổng KH lũy kế là đối tượng tiếp cận chương trình</w:t>
             </w:r>
           </w:p>
         </w:tc>
@@ -18576,12 +19011,15 @@
               <w:rPr>
                 <w:sz w:val="17"/>
               </w:rPr>
-              <w:t>186.709; 186.709; 186.709; 186.709; 186.709; 186.709; 186.709; 186.709; Tổng 186.709</w:t>
+              <w:t>429.963; 482.435; 534.908; 587.380; 639.853; 692.325; 744.798; 797.270; Giá trị cuối kỳ T8 797.270</w:t>
             </w:r>
           </w:p>
         </w:tc>
       </w:tr>
       <w:tr>
+        <w:trPr>
+          <w:cantSplit/>
+        </w:trPr>
         <w:tc>
           <w:tcPr>
             <w:tcW w:w="3900" w:type="dxa"/>
@@ -18608,7 +19046,7 @@
                 <w:b/>
                 <w:sz w:val="17"/>
               </w:rPr>
-              <w:t>SP mới: Auto Billing</w:t>
+              <w:t>Tổng KH tham gia trong chương trình (lũy kế)</w:t>
             </w:r>
           </w:p>
         </w:tc>
@@ -18637,12 +19075,15 @@
               <w:rPr>
                 <w:sz w:val="17"/>
               </w:rPr>
-              <w:t>7.741; 8.833; 9.148; 9.191; 9.737; 9.507; 9.780; 10.053; Tổng 93.452</w:t>
+              <w:t>186.709; 213.994; 241.280; 268.566; 295.851; 323.137; 350.423; 377.708; Giá trị cuối kỳ T8 377.708</w:t>
             </w:r>
           </w:p>
         </w:tc>
       </w:tr>
       <w:tr>
+        <w:trPr>
+          <w:cantSplit/>
+        </w:trPr>
         <w:tc>
           <w:tcPr>
             <w:tcW w:w="3900" w:type="dxa"/>
@@ -18669,7 +19110,7 @@
                 <w:b/>
                 <w:sz w:val="17"/>
               </w:rPr>
-              <w:t>SP mới: Sổ tiết kiệm ưu đãi</w:t>
+              <w:t>SP mới: Auto Billing đăng ký thêm trong tháng</w:t>
             </w:r>
           </w:p>
         </w:tc>
@@ -18698,12 +19139,15 @@
               <w:rPr>
                 <w:sz w:val="17"/>
               </w:rPr>
-              <w:t>8.559; 8.978; 9.099; 9.309; 9.518; 9.430; 9.535; 9.639; Tổng 115.834</w:t>
+              <w:t>7.741; 8.833; 9.148; 9.191; 9.737; 9.507; 9.780; 10.053; Tổng 93.452</w:t>
             </w:r>
           </w:p>
         </w:tc>
       </w:tr>
       <w:tr>
+        <w:trPr>
+          <w:cantSplit/>
+        </w:trPr>
         <w:tc>
           <w:tcPr>
             <w:tcW w:w="3900" w:type="dxa"/>
@@ -18730,7 +19174,7 @@
                 <w:b/>
                 <w:sz w:val="17"/>
               </w:rPr>
-              <w:t>SP mới: Hợp đồng bảo hiểm PNT</w:t>
+              <w:t>SP mới: Sổ tiết kiệm ưu đãi mở thêm trong tháng</w:t>
             </w:r>
           </w:p>
         </w:tc>
@@ -18759,12 +19203,15 @@
               <w:rPr>
                 <w:sz w:val="17"/>
               </w:rPr>
-              <w:t>2.391; 2.413; 2.531; 2.671; 2.707; 2.766; 2.798; 2.879; Tổng 26.011</w:t>
+              <w:t>8.559; 8.978; 9.099; 9.309; 9.518; 9.430; 9.535; 9.639; Tổng 115.834</w:t>
             </w:r>
           </w:p>
         </w:tc>
       </w:tr>
       <w:tr>
+        <w:trPr>
+          <w:cantSplit/>
+        </w:trPr>
         <w:tc>
           <w:tcPr>
             <w:tcW w:w="3900" w:type="dxa"/>
@@ -18791,7 +19238,7 @@
                 <w:b/>
                 <w:sz w:val="17"/>
               </w:rPr>
-              <w:t>SP mới: TK chứng khoán SHS</w:t>
+              <w:t>SP mới: Hợp đồng bảo hiểm PNT bán thêm trong tháng</w:t>
             </w:r>
           </w:p>
         </w:tc>
@@ -18820,12 +19267,15 @@
               <w:rPr>
                 <w:sz w:val="17"/>
               </w:rPr>
-              <w:t>3.734; 3.892; 4.146; 4.268; 4.308; 4.344; 4.326; 4.330; Tổng 42.146</w:t>
+              <w:t>2.391; 2.413; 2.531; 2.671; 2.707; 2.766; 2.798; 2.879; Tổng 26.011</w:t>
             </w:r>
           </w:p>
         </w:tc>
       </w:tr>
       <w:tr>
+        <w:trPr>
+          <w:cantSplit/>
+        </w:trPr>
         <w:tc>
           <w:tcPr>
             <w:tcW w:w="3900" w:type="dxa"/>
@@ -18852,7 +19302,7 @@
                 <w:b/>
                 <w:sz w:val="17"/>
               </w:rPr>
-              <w:t>SP mới: Thẻ tín dụng</w:t>
+              <w:t>SP mới: Tài khoản chứng khoán SHS mở thêm trong tháng</w:t>
             </w:r>
           </w:p>
         </w:tc>
@@ -18881,12 +19331,15 @@
               <w:rPr>
                 <w:sz w:val="17"/>
               </w:rPr>
-              <w:t>7.182; 9.228; 9.335; 10.700; 11.094; 11.148; 10.861; 10.814; Tổng 85.605</w:t>
+              <w:t>3.734; 3.892; 4.146; 4.268; 4.308; 4.344; 4.326; 4.330; Tổng 42.146</w:t>
             </w:r>
           </w:p>
         </w:tc>
       </w:tr>
       <w:tr>
+        <w:trPr>
+          <w:cantSplit/>
+        </w:trPr>
         <w:tc>
           <w:tcPr>
             <w:tcW w:w="3900" w:type="dxa"/>
@@ -18913,7 +19366,7 @@
                 <w:b/>
                 <w:sz w:val="17"/>
               </w:rPr>
-              <w:t>SP mới: HĐ thấu chi sổ TK</w:t>
+              <w:t>SP mới: Thẻ tín dụng mở thêm trong tháng</w:t>
             </w:r>
           </w:p>
         </w:tc>
@@ -18942,12 +19395,15 @@
               <w:rPr>
                 <w:sz w:val="17"/>
               </w:rPr>
-              <w:t>233; 315; 474; 661; 797; 856; 888; 969; Tổng 5.192</w:t>
+              <w:t>7.182; 9.228; 9.335; 10.700; 11.094; 11.148; 10.861; 10.814; Tổng 85.605</w:t>
             </w:r>
           </w:p>
         </w:tc>
       </w:tr>
       <w:tr>
+        <w:trPr>
+          <w:cantSplit/>
+        </w:trPr>
         <w:tc>
           <w:tcPr>
             <w:tcW w:w="3900" w:type="dxa"/>
@@ -18974,7 +19430,7 @@
                 <w:b/>
                 <w:sz w:val="17"/>
               </w:rPr>
-              <w:t>Tổng SP/DV tăng thêm trong tháng</w:t>
+              <w:t>SP mới: HĐ thấu chi sổ TK mở thêm trong tháng</w:t>
             </w:r>
           </w:p>
         </w:tc>
@@ -19003,12 +19459,15 @@
               <w:rPr>
                 <w:sz w:val="17"/>
               </w:rPr>
-              <w:t>29.840; 33.658; 34.734; 36.800; 38.162; 38.051; 38.186; 38.685; Tổng 368.240</w:t>
+              <w:t>233; 315; 474; 661; 797; 856; 888; 969; Tổng 5.192</w:t>
             </w:r>
           </w:p>
         </w:tc>
       </w:tr>
       <w:tr>
+        <w:trPr>
+          <w:cantSplit/>
+        </w:trPr>
         <w:tc>
           <w:tcPr>
             <w:tcW w:w="3900" w:type="dxa"/>
@@ -19035,6 +19494,70 @@
                 <w:b/>
                 <w:sz w:val="17"/>
               </w:rPr>
+              <w:t>Tổng SP/DV tăng thêm trong tháng</w:t>
+            </w:r>
+          </w:p>
+        </w:tc>
+        <w:tc>
+          <w:tcPr>
+            <w:tcW w:w="5460" w:type="dxa"/>
+            <w:tcBorders>
+              <w:top w:val="single" w:sz="4" w:space="0" w:color="D2D8E1"/>
+              <w:left w:val="single" w:sz="4" w:space="0" w:color="D2D8E1"/>
+              <w:bottom w:val="single" w:sz="4" w:space="0" w:color="D2D8E1"/>
+              <w:right w:val="single" w:sz="4" w:space="0" w:color="D2D8E1"/>
+            </w:tcBorders>
+            <w:tcMar>
+              <w:top w:w="80" w:type="dxa"/>
+              <w:left w:w="120" w:type="dxa"/>
+              <w:bottom w:w="80" w:type="dxa"/>
+              <w:right w:w="120" w:type="dxa"/>
+            </w:tcMar>
+            <w:vAlign w:val="center"/>
+          </w:tcPr>
+          <w:p>
+            <w:pPr>
+              <w:spacing w:after="0" w:line="264" w:lineRule="auto"/>
+            </w:pPr>
+            <w:r>
+              <w:rPr>
+                <w:sz w:val="17"/>
+              </w:rPr>
+              <w:t>29.840; 33.658; 34.734; 36.800; 38.162; 38.051; 38.186; 38.685; Tổng 368.240</w:t>
+            </w:r>
+          </w:p>
+        </w:tc>
+      </w:tr>
+      <w:tr>
+        <w:trPr>
+          <w:cantSplit/>
+        </w:trPr>
+        <w:tc>
+          <w:tcPr>
+            <w:tcW w:w="3900" w:type="dxa"/>
+            <w:tcBorders>
+              <w:top w:val="single" w:sz="4" w:space="0" w:color="D2D8E1"/>
+              <w:left w:val="single" w:sz="4" w:space="0" w:color="D2D8E1"/>
+              <w:bottom w:val="single" w:sz="4" w:space="0" w:color="D2D8E1"/>
+              <w:right w:val="single" w:sz="4" w:space="0" w:color="D2D8E1"/>
+            </w:tcBorders>
+            <w:tcMar>
+              <w:top w:w="80" w:type="dxa"/>
+              <w:left w:w="120" w:type="dxa"/>
+              <w:bottom w:w="80" w:type="dxa"/>
+              <w:right w:w="120" w:type="dxa"/>
+            </w:tcMar>
+            <w:vAlign w:val="center"/>
+          </w:tcPr>
+          <w:p>
+            <w:pPr>
+              <w:spacing w:after="0" w:line="264" w:lineRule="auto"/>
+            </w:pPr>
+            <w:r>
+              <w:rPr>
+                <w:b/>
+                <w:sz w:val="17"/>
+              </w:rPr>
               <w:t>Lũy kế tổng SP/DV tăng thêm</w:t>
             </w:r>
           </w:p>
@@ -19064,7 +19587,135 @@
               <w:rPr>
                 <w:sz w:val="17"/>
               </w:rPr>
-              <w:t>109.964; 143.622; 178.356; 215.155; 253.318; 291.369; 329.555; 368.240; Tổng 368.240</w:t>
+              <w:t>109.964; 143.622; 178.356; 215.155; 253.318; 291.369; 329.555; 368.240; Giá trị cuối kỳ T8 368.240</w:t>
+            </w:r>
+          </w:p>
+        </w:tc>
+      </w:tr>
+      <w:tr>
+        <w:trPr>
+          <w:cantSplit/>
+        </w:trPr>
+        <w:tc>
+          <w:tcPr>
+            <w:tcW w:w="3900" w:type="dxa"/>
+            <w:tcBorders>
+              <w:top w:val="single" w:sz="4" w:space="0" w:color="D2D8E1"/>
+              <w:left w:val="single" w:sz="4" w:space="0" w:color="D2D8E1"/>
+              <w:bottom w:val="single" w:sz="4" w:space="0" w:color="D2D8E1"/>
+              <w:right w:val="single" w:sz="4" w:space="0" w:color="D2D8E1"/>
+            </w:tcBorders>
+            <w:tcMar>
+              <w:top w:w="80" w:type="dxa"/>
+              <w:left w:w="120" w:type="dxa"/>
+              <w:bottom w:w="80" w:type="dxa"/>
+              <w:right w:w="120" w:type="dxa"/>
+            </w:tcMar>
+            <w:vAlign w:val="center"/>
+          </w:tcPr>
+          <w:p>
+            <w:pPr>
+              <w:spacing w:after="0" w:line="264" w:lineRule="auto"/>
+            </w:pPr>
+            <w:r>
+              <w:rPr>
+                <w:b/>
+                <w:sz w:val="17"/>
+              </w:rPr>
+              <w:t>Số lượng SPDV bình quân/KH với full tập KH mới</w:t>
+            </w:r>
+          </w:p>
+        </w:tc>
+        <w:tc>
+          <w:tcPr>
+            <w:tcW w:w="5460" w:type="dxa"/>
+            <w:tcBorders>
+              <w:top w:val="single" w:sz="4" w:space="0" w:color="D2D8E1"/>
+              <w:left w:val="single" w:sz="4" w:space="0" w:color="D2D8E1"/>
+              <w:bottom w:val="single" w:sz="4" w:space="0" w:color="D2D8E1"/>
+              <w:right w:val="single" w:sz="4" w:space="0" w:color="D2D8E1"/>
+            </w:tcBorders>
+            <w:tcMar>
+              <w:top w:w="80" w:type="dxa"/>
+              <w:left w:w="120" w:type="dxa"/>
+              <w:bottom w:w="80" w:type="dxa"/>
+              <w:right w:w="120" w:type="dxa"/>
+            </w:tcMar>
+            <w:vAlign w:val="center"/>
+          </w:tcPr>
+          <w:p>
+            <w:pPr>
+              <w:spacing w:after="0" w:line="264" w:lineRule="auto"/>
+            </w:pPr>
+            <w:r>
+              <w:rPr>
+                <w:sz w:val="17"/>
+              </w:rPr>
+              <w:t>2,23; 2,35; 2,44; 2,52; 2,59; 2,64; 2,67; 2,70; Giá trị cuối kỳ 2,70</w:t>
+            </w:r>
+          </w:p>
+        </w:tc>
+      </w:tr>
+      <w:tr>
+        <w:trPr>
+          <w:cantSplit/>
+        </w:trPr>
+        <w:tc>
+          <w:tcPr>
+            <w:tcW w:w="3900" w:type="dxa"/>
+            <w:tcBorders>
+              <w:top w:val="single" w:sz="4" w:space="0" w:color="D2D8E1"/>
+              <w:left w:val="single" w:sz="4" w:space="0" w:color="D2D8E1"/>
+              <w:bottom w:val="single" w:sz="4" w:space="0" w:color="D2D8E1"/>
+              <w:right w:val="single" w:sz="4" w:space="0" w:color="D2D8E1"/>
+            </w:tcBorders>
+            <w:tcMar>
+              <w:top w:w="80" w:type="dxa"/>
+              <w:left w:w="120" w:type="dxa"/>
+              <w:bottom w:w="80" w:type="dxa"/>
+              <w:right w:w="120" w:type="dxa"/>
+            </w:tcMar>
+            <w:vAlign w:val="center"/>
+          </w:tcPr>
+          <w:p>
+            <w:pPr>
+              <w:spacing w:after="0" w:line="264" w:lineRule="auto"/>
+            </w:pPr>
+            <w:r>
+              <w:rPr>
+                <w:b/>
+                <w:sz w:val="17"/>
+              </w:rPr>
+              <w:t>Số lượng SPDV bình quân/KH với tập KH tham gia chương trình</w:t>
+            </w:r>
+          </w:p>
+        </w:tc>
+        <w:tc>
+          <w:tcPr>
+            <w:tcW w:w="5460" w:type="dxa"/>
+            <w:tcBorders>
+              <w:top w:val="single" w:sz="4" w:space="0" w:color="D2D8E1"/>
+              <w:left w:val="single" w:sz="4" w:space="0" w:color="D2D8E1"/>
+              <w:bottom w:val="single" w:sz="4" w:space="0" w:color="D2D8E1"/>
+              <w:right w:val="single" w:sz="4" w:space="0" w:color="D2D8E1"/>
+            </w:tcBorders>
+            <w:tcMar>
+              <w:top w:w="80" w:type="dxa"/>
+              <w:left w:w="120" w:type="dxa"/>
+              <w:bottom w:w="80" w:type="dxa"/>
+              <w:right w:w="120" w:type="dxa"/>
+            </w:tcMar>
+            <w:vAlign w:val="center"/>
+          </w:tcPr>
+          <w:p>
+            <w:pPr>
+              <w:spacing w:after="0" w:line="264" w:lineRule="auto"/>
+            </w:pPr>
+            <w:r>
+              <w:rPr>
+                <w:sz w:val="17"/>
+              </w:rPr>
+              <w:t>2,72; 2,83; 2,90; 2,97; 3,02; 3,06; 3,09; 3,10; Giá trị cuối kỳ 3,10</w:t>
             </w:r>
           </w:p>
         </w:tc>
@@ -19078,7 +19729,7 @@
         <w:rPr>
           <w:rFonts w:ascii="Calibri" w:eastAsia="Calibri" w:hAnsi="Calibri"/>
         </w:rPr>
-        <w:t>B. CASA tăng thêm và thu nhập</w:t>
+        <w:t>B. CASA và thu nhập tăng thêm (Incremental Revenue)</w:t>
       </w:r>
     </w:p>
     <w:p>
@@ -19100,6 +19751,7 @@
       </w:tblGrid>
       <w:tr>
         <w:trPr>
+          <w:cantSplit/>
           <w:tblHeader/>
         </w:trPr>
         <w:tc>
@@ -19131,7 +19783,7 @@
                 <w:color w:val="0B2545"/>
                 <w:sz w:val="17"/>
               </w:rPr>
-              <w:t>Chỉ tiêu</w:t>
+              <w:t>Chỉ tiêu CASA và thu nhập tăng thêm</w:t>
             </w:r>
           </w:p>
         </w:tc>
@@ -19164,12 +19816,15 @@
                 <w:color w:val="0B2545"/>
                 <w:sz w:val="17"/>
               </w:rPr>
-              <w:t>T1/27 -&gt; T8/27; Tổng 12 tháng</w:t>
+              <w:t>T1/27 → T8/27; Tổng chu kỳ 12 tháng T9/2026–T8/2027</w:t>
             </w:r>
           </w:p>
         </w:tc>
       </w:tr>
       <w:tr>
+        <w:trPr>
+          <w:cantSplit/>
+        </w:trPr>
         <w:tc>
           <w:tcPr>
             <w:tcW w:w="3900" w:type="dxa"/>
@@ -19225,12 +19880,15 @@
               <w:rPr>
                 <w:sz w:val="17"/>
               </w:rPr>
-              <w:t>19.042.155.225; 25.224.993.269; 31.628.871.077; 38.062.788.729; 44.878.706.224; 51.533.663.641; 58.379.620.980; 65.416.578.241; Tổng 65.416.578.241</w:t>
+              <w:t>58.683.288.019; 73.051.836.994; 87.061.425.733; 102.261.054.316; 117.262.682.743; 132.103.351.091; 147.135.019.361; 162.357.687.553; Giá trị cuối kỳ T8 162.357.687.553</w:t>
             </w:r>
           </w:p>
         </w:tc>
       </w:tr>
       <w:tr>
+        <w:trPr>
+          <w:cantSplit/>
+        </w:trPr>
         <w:tc>
           <w:tcPr>
             <w:tcW w:w="3900" w:type="dxa"/>
@@ -19257,7 +19915,8 @@
                 <w:b/>
                 <w:sz w:val="17"/>
               </w:rPr>
-              <w:t>Thu thuần NIM CASA</w:t>
+              <w:lastRenderedPageBreak/>
+              <w:t>Thu thuần NIM CASA trong tháng</w:t>
             </w:r>
           </w:p>
         </w:tc>
@@ -19286,12 +19945,15 @@
               <w:rPr>
                 <w:sz w:val="17"/>
               </w:rPr>
-              <w:t>63.473.851; 84.083.311; 105.429.570; 126.875.962; 149.595.687; 171.778.879; 194.598.737; 218.055.261; Tổng 1.210.479.238</w:t>
+              <w:t>195.610.960; 243.506.123; 292.138.086; 340.870.181; 390.875.609; 440.344.504; 490.450.065; 541.192.292; Tổng 12 tháng 3.249.057.178</w:t>
             </w:r>
           </w:p>
         </w:tc>
       </w:tr>
       <w:tr>
+        <w:trPr>
+          <w:cantSplit/>
+        </w:trPr>
         <w:tc>
           <w:tcPr>
             <w:tcW w:w="3900" w:type="dxa"/>
@@ -19318,7 +19980,7 @@
                 <w:b/>
                 <w:sz w:val="17"/>
               </w:rPr>
-              <w:t>Thu thuần TGCKH</w:t>
+              <w:t>Thu thuần TGCKH trong tháng</w:t>
             </w:r>
           </w:p>
         </w:tc>
@@ -19347,12 +20009,15 @@
               <w:rPr>
                 <w:sz w:val="17"/>
               </w:rPr>
-              <w:t>838.770.240; 988.401.449; 1.140.053.594; 1.295.198.309; 1.453.835.594; 1.611.001.244; 1.769.913.179; 1.930.571.399; Tổng 13.015.443.803</w:t>
+              <w:t>838.770.240; 988.401.449; 1.140.053.594; 1.295.198.309; 1.453.835.594; 1.611.001.244; 1.769.913.179; 1.930.571.399; Tổng 12 tháng 13.015.443.803</w:t>
             </w:r>
           </w:p>
         </w:tc>
       </w:tr>
       <w:tr>
+        <w:trPr>
+          <w:cantSplit/>
+        </w:trPr>
         <w:tc>
           <w:tcPr>
             <w:tcW w:w="3900" w:type="dxa"/>
@@ -19379,7 +20044,7 @@
                 <w:b/>
                 <w:sz w:val="17"/>
               </w:rPr>
-              <w:t>Thu phí giao dịch thẻ tín dụng</w:t>
+              <w:t>Thu phí giao dịch thẻ tín dụng trong tháng</w:t>
             </w:r>
           </w:p>
         </w:tc>
@@ -19408,12 +20073,15 @@
               <w:rPr>
                 <w:sz w:val="17"/>
               </w:rPr>
-              <w:t>397.577.062; 692.877.562; 991.611.187; 1.334.001.937; 1.689.023.530; 2.045.761.686; 2.393.302.124; 2.739.346.330; Tổng 12.575.368.793</w:t>
+              <w:t>397.577.062; 692.877.562; 991.611.187; 1.334.001.937; 1.689.023.530; 2.045.761.686; 2.393.302.124; 2.739.346.330; Tổng 12 tháng 12.575.368.793</w:t>
             </w:r>
           </w:p>
         </w:tc>
       </w:tr>
       <w:tr>
+        <w:trPr>
+          <w:cantSplit/>
+        </w:trPr>
         <w:tc>
           <w:tcPr>
             <w:tcW w:w="3900" w:type="dxa"/>
@@ -19440,7 +20108,7 @@
                 <w:b/>
                 <w:sz w:val="17"/>
               </w:rPr>
-              <w:t>Thu hoa hồng bảo hiểm PNT</w:t>
+              <w:t>Thu hoa hồng bảo hiểm phi nhân thọ trong tháng</w:t>
             </w:r>
           </w:p>
         </w:tc>
@@ -19469,12 +20137,15 @@
               <w:rPr>
                 <w:sz w:val="17"/>
               </w:rPr>
-              <w:t>1.183.714.382; 1.194.335.613; 1.252.609.797; 1.322.266.158; 1.340.021.073; 1.369.158.165; 1.384.788.835; 1.425.308.104; Tổng 12.875.299.315</w:t>
+              <w:t>1.183.714.382; 1.194.335.613; 1.252.609.797; 1.322.266.158; 1.340.021.073; 1.369.158.165; 1.384.788.835; 1.425.308.104; Tổng 12 tháng 12.875.299.315</w:t>
             </w:r>
           </w:p>
         </w:tc>
       </w:tr>
       <w:tr>
+        <w:trPr>
+          <w:cantSplit/>
+        </w:trPr>
         <w:tc>
           <w:tcPr>
             <w:tcW w:w="3900" w:type="dxa"/>
@@ -19501,8 +20172,7 @@
                 <w:b/>
                 <w:sz w:val="17"/>
               </w:rPr>
-              <w:lastRenderedPageBreak/>
-              <w:t>Thu chia sẻ doanh thu chứng khoán SHS</w:t>
+              <w:t>Thu chia sẻ doanh thu chứng khoán SHS trong tháng</w:t>
             </w:r>
           </w:p>
         </w:tc>
@@ -19537,6 +20207,9 @@
         </w:tc>
       </w:tr>
       <w:tr>
+        <w:trPr>
+          <w:cantSplit/>
+        </w:trPr>
         <w:tc>
           <w:tcPr>
             <w:tcW w:w="3900" w:type="dxa"/>
@@ -19563,7 +20236,7 @@
                 <w:b/>
                 <w:sz w:val="17"/>
               </w:rPr>
-              <w:t>Thu phí TKSĐ</w:t>
+              <w:t>Thu phí TKSĐ trong tháng</w:t>
             </w:r>
           </w:p>
         </w:tc>
@@ -19592,12 +20265,15 @@
               <w:rPr>
                 <w:sz w:val="17"/>
               </w:rPr>
-              <w:t>2.619.427.498 mỗi tháng; Tổng 31.433.129.976</w:t>
+              <w:t>2.619.427.498 mỗi tháng; Tổng 12 tháng 31.433.129.976</w:t>
             </w:r>
           </w:p>
         </w:tc>
       </w:tr>
       <w:tr>
+        <w:trPr>
+          <w:cantSplit/>
+        </w:trPr>
         <w:tc>
           <w:tcPr>
             <w:tcW w:w="3900" w:type="dxa"/>
@@ -19624,7 +20300,7 @@
                 <w:b/>
                 <w:sz w:val="17"/>
               </w:rPr>
-              <w:t>Thu lãi cho vay thấu chi</w:t>
+              <w:t>Thu lãi cho vay thấu chi trong tháng</w:t>
             </w:r>
           </w:p>
         </w:tc>
@@ -19653,12 +20329,15 @@
               <w:rPr>
                 <w:sz w:val="17"/>
               </w:rPr>
-              <w:t>7.756.570; 18.241.171; 34.040.945; 56.063.797; 82.634.266; 111.166.828; 140.751.961; 173.065.664; Tổng 623.721.742</w:t>
+              <w:t>7.756.570; 18.241.711; 34.040.945; 56.063.797; 82.634.266; 111.166.828; 140.751.961; 173.065.664; Tổng 12 tháng 623.721.742</w:t>
             </w:r>
           </w:p>
         </w:tc>
       </w:tr>
       <w:tr>
+        <w:trPr>
+          <w:cantSplit/>
+        </w:trPr>
         <w:tc>
           <w:tcPr>
             <w:tcW w:w="3900" w:type="dxa"/>
@@ -19714,7 +20393,7 @@
               <w:rPr>
                 <w:sz w:val="17"/>
               </w:rPr>
-              <w:t>5.110.719.603; 5.597.367.144; 6.143.172.592; 6.753.833.661; 7.334.537.649; 7.928.294.301; 8.502.782.332; 9.105.774.255; Tổng 71.733.442.866</w:t>
+              <w:t>5.242.856.712; 5.756.789.956; 6.329.881.107; 6.967.827.880; 7.575.817.570; 8.196.859.925; 8.798.633.660; 9.428.911.286; Tổng 12 tháng 73.772.020.807</w:t>
             </w:r>
           </w:p>
         </w:tc>
@@ -19728,7 +20407,7 @@
         <w:rPr>
           <w:rFonts w:ascii="Calibri" w:eastAsia="Calibri" w:hAnsi="Calibri"/>
         </w:rPr>
-        <w:t>C. Chi phí</w:t>
+        <w:t>C. Chi phí tăng thêm (Incremental Costs)</w:t>
       </w:r>
     </w:p>
     <w:p>
@@ -19750,6 +20429,7 @@
       </w:tblGrid>
       <w:tr>
         <w:trPr>
+          <w:cantSplit/>
           <w:tblHeader/>
         </w:trPr>
         <w:tc>
@@ -19781,7 +20461,7 @@
                 <w:color w:val="0B2545"/>
                 <w:sz w:val="17"/>
               </w:rPr>
-              <w:t>Chỉ tiêu</w:t>
+              <w:t>Chỉ tiêu chi phí</w:t>
             </w:r>
           </w:p>
         </w:tc>
@@ -19814,12 +20494,15 @@
                 <w:color w:val="0B2545"/>
                 <w:sz w:val="17"/>
               </w:rPr>
-              <w:t>T1/27 -&gt; T8/27; Tổng 12 tháng</w:t>
+              <w:t>T1/27 → T8/27; Tổng chu kỳ 12 tháng T9/2026–T8/2027</w:t>
             </w:r>
           </w:p>
         </w:tc>
       </w:tr>
       <w:tr>
+        <w:trPr>
+          <w:cantSplit/>
+        </w:trPr>
         <w:tc>
           <w:tcPr>
             <w:tcW w:w="3900" w:type="dxa"/>
@@ -19875,12 +20558,15 @@
               <w:rPr>
                 <w:sz w:val="17"/>
               </w:rPr>
-              <w:t>654.856.874 mỗi tháng; Tổng 7.858.282.494</w:t>
+              <w:t>654.856.874 mỗi tháng; Tổng 12 tháng 7.858.282.494</w:t>
             </w:r>
           </w:p>
         </w:tc>
       </w:tr>
       <w:tr>
+        <w:trPr>
+          <w:cantSplit/>
+        </w:trPr>
         <w:tc>
           <w:tcPr>
             <w:tcW w:w="3900" w:type="dxa"/>
@@ -19907,7 +20593,7 @@
                 <w:b/>
                 <w:sz w:val="17"/>
               </w:rPr>
-              <w:t>Chi phí thưởng lãi suất tiết kiệm</w:t>
+              <w:t>Chi phí thưởng lãi suất tiết kiệm - Bước 3a</w:t>
             </w:r>
           </w:p>
         </w:tc>
@@ -19936,12 +20622,15 @@
               <w:rPr>
                 <w:sz w:val="17"/>
               </w:rPr>
-              <w:t>167.754.048; 197.680.290; 228.010.719; 259.039.662; 290.767.119; 322.200.249; 353.982.636; 386.114.280; Tổng 2.603.088.761</w:t>
+              <w:t>167.754.048; 197.680.290; 228.010.719; 259.039.662; 290.767.119; 322.200.249; 353.982.636; 386.114.280; Tổng 12 tháng 2.603.088.761</w:t>
             </w:r>
           </w:p>
         </w:tc>
       </w:tr>
       <w:tr>
+        <w:trPr>
+          <w:cantSplit/>
+        </w:trPr>
         <w:tc>
           <w:tcPr>
             <w:tcW w:w="3900" w:type="dxa"/>
@@ -20003,6 +20692,9 @@
         </w:tc>
       </w:tr>
       <w:tr>
+        <w:trPr>
+          <w:cantSplit/>
+        </w:trPr>
         <w:tc>
           <w:tcPr>
             <w:tcW w:w="3900" w:type="dxa"/>
@@ -20058,12 +20750,15 @@
               <w:rPr>
                 <w:sz w:val="17"/>
               </w:rPr>
-              <w:t>119.567.109; 120.639.961; 126.526.242; 133.562.238; 133.562.664; 138.298.805; 139.877.660; 143.970.516; Tổng 1.300.535.284</w:t>
+              <w:t>119.567.109; 120.639.961; 126.526.242; 133.562.238; 135.355.664; 138.298.805; 139.877.660; 143.970.516; Tổng 12 tháng 1.300.535.284</w:t>
             </w:r>
           </w:p>
         </w:tc>
       </w:tr>
       <w:tr>
+        <w:trPr>
+          <w:cantSplit/>
+        </w:trPr>
         <w:tc>
           <w:tcPr>
             <w:tcW w:w="3900" w:type="dxa"/>
@@ -20090,7 +20785,7 @@
                 <w:b/>
                 <w:sz w:val="17"/>
               </w:rPr>
-              <w:t>Chi phí quick win one-time</w:t>
+              <w:t>Chi phí triển khai quick win (một lần, ghi nhận T9/2026)</w:t>
             </w:r>
           </w:p>
         </w:tc>
@@ -20119,12 +20814,15 @@
               <w:rPr>
                 <w:sz w:val="17"/>
               </w:rPr>
-              <w:t>Không phát sinh trong các tháng; Tổng 12 tháng 240.000.000</w:t>
+              <w:t>Không phát sinh T1–T8/2027; Tổng 12 tháng 240.000.000</w:t>
             </w:r>
           </w:p>
         </w:tc>
       </w:tr>
       <w:tr>
+        <w:trPr>
+          <w:cantSplit/>
+        </w:trPr>
         <w:tc>
           <w:tcPr>
             <w:tcW w:w="3900" w:type="dxa"/>
@@ -20151,7 +20849,7 @@
                 <w:b/>
                 <w:sz w:val="17"/>
               </w:rPr>
-              <w:t>Chi phí nền tảng dài hạn</w:t>
+              <w:t>Chi phí xây dựng hệ thống nền tảng dài hạn</w:t>
             </w:r>
           </w:p>
         </w:tc>
@@ -20180,12 +20878,15 @@
               <w:rPr>
                 <w:sz w:val="17"/>
               </w:rPr>
-              <w:t>Không phát sinh trong các tháng; Tổng 12 tháng 645.000.000</w:t>
+              <w:t>Không phát sinh T1–T8/2027; Tổng 12 tháng 645.000.000</w:t>
             </w:r>
           </w:p>
         </w:tc>
       </w:tr>
       <w:tr>
+        <w:trPr>
+          <w:cantSplit/>
+        </w:trPr>
         <w:tc>
           <w:tcPr>
             <w:tcW w:w="3900" w:type="dxa"/>
@@ -20241,7 +20942,7 @@
               <w:rPr>
                 <w:sz w:val="17"/>
               </w:rPr>
-              <w:t>942.178.032; 973.177.125; 1.009.393.835; 1.047.458.775; 1.080.979.657; 1.115.355.928; 1.148.717.170; 1.184.941.670; Tổng 12.646.906.539</w:t>
+              <w:t>942.178.032; 973.177.125; 1.009.393.835; 1.047.458.775; 1.080.979.657; 1.115.355.928; 1.148.717.170; 1.184.941.670; Tổng 12 tháng 12.646.906.539</w:t>
             </w:r>
           </w:p>
         </w:tc>
@@ -20255,7 +20956,7 @@
         <w:rPr>
           <w:rFonts w:ascii="Calibri" w:eastAsia="Calibri" w:hAnsi="Calibri"/>
         </w:rPr>
-        <w:t>D. Hiệu quả ròng</w:t>
+        <w:t>D. Đóng góp ròng tăng thêm (Incremental Contribution)</w:t>
       </w:r>
     </w:p>
     <w:p>
@@ -20277,6 +20978,7 @@
       </w:tblGrid>
       <w:tr>
         <w:trPr>
+          <w:cantSplit/>
           <w:tblHeader/>
         </w:trPr>
         <w:tc>
@@ -20308,7 +21010,8 @@
                 <w:color w:val="0B2545"/>
                 <w:sz w:val="17"/>
               </w:rPr>
-              <w:t>Chỉ tiêu</w:t>
+              <w:lastRenderedPageBreak/>
+              <w:t>Chỉ tiêu đóng góp ròng tăng thêm</w:t>
             </w:r>
           </w:p>
         </w:tc>
@@ -20341,12 +21044,15 @@
                 <w:color w:val="0B2545"/>
                 <w:sz w:val="17"/>
               </w:rPr>
-              <w:t>T1/27 -&gt; T8/27; Tổng 12 tháng</w:t>
+              <w:t>T1/27 → T8/27; Tổng chu kỳ 12 tháng T9/2026–T8/2027</w:t>
             </w:r>
           </w:p>
         </w:tc>
       </w:tr>
       <w:tr>
+        <w:trPr>
+          <w:cantSplit/>
+        </w:trPr>
         <w:tc>
           <w:tcPr>
             <w:tcW w:w="3900" w:type="dxa"/>
@@ -20373,7 +21079,7 @@
                 <w:b/>
                 <w:sz w:val="17"/>
               </w:rPr>
-              <w:t>Lợi nhuận ròng trong tháng</w:t>
+              <w:t>Đóng góp ròng tăng thêm trong tháng*</w:t>
             </w:r>
           </w:p>
         </w:tc>
@@ -20402,12 +21108,15 @@
               <w:rPr>
                 <w:sz w:val="17"/>
               </w:rPr>
-              <w:t>4.168.541.571; 4.624.190.019; 5.133.778.756; 5.706.374.887; 6.253.557.991; 6.812.938.373; 7.354.065.162; 7.920.832.585; Tổng 59.086.536.328</w:t>
+              <w:t>4.300.678.681; 4.783.612.831; 5.320.487.272; 5.920.369.106; 6.494.837.913; 7.081.503.998; 7.649.916.490; 8.243.969.616; Tổng 12 tháng 61.125.114.268</w:t>
             </w:r>
           </w:p>
         </w:tc>
       </w:tr>
       <w:tr>
+        <w:trPr>
+          <w:cantSplit/>
+        </w:trPr>
         <w:tc>
           <w:tcPr>
             <w:tcW w:w="3900" w:type="dxa"/>
@@ -20434,7 +21143,7 @@
                 <w:b/>
                 <w:sz w:val="17"/>
               </w:rPr>
-              <w:t>Lợi nhuận ròng lũy kế</w:t>
+              <w:t>Đóng góp ròng tăng thêm lũy kế*</w:t>
             </w:r>
           </w:p>
         </w:tc>
@@ -20463,7 +21172,7 @@
               <w:rPr>
                 <w:sz w:val="17"/>
               </w:rPr>
-              <w:t>4.168.541.571; 8.792.731.590; 13.926.510.346; 19.632.885.234; 25.886.443.224; 32.699.381.598; 40.053.446.759; 47.974.279.344; Tổng 59.086.536.328</w:t>
+              <w:t>15.630.417.042; 20.414.029.873; 25.734.517.145; 31.654.886.251; 38.149.724.164; 45.231.228.162; 52.881.144.652; 61.125.114.268; Giá trị cuối kỳ T8 61.125.114.268</w:t>
             </w:r>
           </w:p>
         </w:tc>
@@ -20480,23 +21189,12 @@
         <w:ind w:left="115" w:right="86"/>
       </w:pPr>
       <w:r>
-        <w:rPr>
-          <w:b/>
-          <w:color w:val="E85B0E"/>
-          <w:sz w:val="21"/>
-        </w:rPr>
-        <w:t xml:space="preserve">Giả thiết chính: </w:t>
-      </w:r>
-      <w:r>
-        <w:rPr>
-          <w:sz w:val="21"/>
-        </w:rPr>
-        <w:t>Tất cả số liệu dựa trên giả định về tỷ lệ chuyển đổi, hành vi khách hàng và hiệu suất sản phẩm; các giả định có thể thay đổi theo thực tế triển khai và dữ liệu cập nhật.</w:t>
+        <w:t>Giả định và phạm vi P&amp;L: Số liệu dựa trên giả định về tỷ lệ chuyển đổi, hành vi khách hàng và hiệu suất sản phẩm. Đây là P&amp;L quản trị cấp chương trình, chưa phải lợi nhuận ròng kế toán vì chưa bao gồm đầy đủ chi phí chung, phân bổ nội bộ, dự phòng rủi ro và thuế. Một số dòng tháng có sai số làm tròn 1 đồng so với phép trừ trực tiếp; tổng chu kỳ được giữ đúng theo bảng nguồn cập nhật.</w:t>
       </w:r>
     </w:p>
     <w:p>
       <w:r>
-        <w:t>Kỳ vọng: mở rộng tệp khách hàng; tăng trưởng CASA bền vững; gia tăng Product Holding và Cross-sell; tối ưu thu nhập, lợi nhuận, CLV và hiệu quả dài hạn.</w:t>
+        <w:t>Kỳ vọng kinh doanh: mở rộng tệp khách hàng; tăng trưởng CASA bền vững; gia tăng độ sâu sở hữu sản phẩm và bán chéo (cross-sell); tối ưu CLV và đóng góp tài chính dài hạn.</w:t>
       </w:r>
     </w:p>
     <w:p>
@@ -20504,6 +21202,8 @@
         <w:pStyle w:val="Heading1"/>
         <w:pageBreakBefore/>
       </w:pPr>
+      <w:bookmarkStart w:id="0" w:name="_GoBack"/>
+      <w:bookmarkEnd w:id="0"/>
       <w:r>
         <w:rPr>
           <w:rFonts w:ascii="Calibri" w:eastAsia="Calibri" w:hAnsi="Calibri"/>
@@ -21268,7 +21968,7 @@
         <w:color w:val="6B7280"/>
         <w:sz w:val="18"/>
       </w:rPr>
-      <w:t>16</w:t>
+      <w:t>29</w:t>
     </w:r>
     <w:r>
       <w:rPr>
@@ -33240,7 +33940,7 @@
 </file>
 
 <file path=customXml/itemProps1.xml><?xml version="1.0" encoding="utf-8"?>
-<ds:datastoreItem xmlns:ds="http://schemas.openxmlformats.org/officeDocument/2006/customXml" ds:itemID="{76D18489-0CBB-40FA-8BD1-CC79B15D6F58}">
+<ds:datastoreItem xmlns:ds="http://schemas.openxmlformats.org/officeDocument/2006/customXml" ds:itemID="{57D6CC91-4FD0-4DA1-AA32-076BF0D8F71A}">
   <ds:schemaRefs>
     <ds:schemaRef ds:uri="http://schemas.openxmlformats.org/officeDocument/2006/bibliography"/>
   </ds:schemaRefs>

</xml_diff>